<commit_message>
Day 10: deepen Materi to the plan's Wissen (rule 2.17) with real findings
All 12 Wissen topics are now full: mixed initiative and the 18 human-AI guidelines, Netflix
recommendations, the Facebook exposure study, use and misuse of automation, trust in automation,
GDPR Articles 13 to 15 and 22 and EU AI Act Article 50. Day 10 added to verify:depth; Word
documents of Day 10 rebuilt.

Co-Authored-By: Claude Sonnet 5.5 <noreply@anthropic.com>
</commit_message>
<xml_diff>
--- a/docx/Day10-Materi-AION-UX-Developer-Intelligent-interfaces-and-AI-supported-interaction.docx
+++ b/docx/Day10-Materi-AION-UX-Developer-Intelligent-interfaces-and-AI-supported-interaction.docx
@@ -2791,6 +2791,266 @@
         <w:spacing w:before="0" w:after="80"/>
       </w:pPr>
     </w:p>
+    <w:p>
+      <w:pPr>
+        <w:spacing w:before="0" w:after="100"/>
+      </w:pPr>
+      <w:r>
+        <w:rPr>
+          <w:b/>
+        </w:rPr>
+        <w:t>Kinds of intelligent behaviour: sources</w:t>
+      </w:r>
+    </w:p>
+    <w:tbl>
+      <w:tblPr>
+        <w:tblW w:w="9638" w:type="dxa"/>
+        <w:tblBorders>
+          <w:top w:val="single" w:sz="4" w:space="0" w:color="D5DEE9"/>
+          <w:left w:val="single" w:sz="4" w:space="0" w:color="D5DEE9"/>
+          <w:bottom w:val="single" w:sz="4" w:space="0" w:color="D5DEE9"/>
+          <w:right w:val="single" w:sz="4" w:space="0" w:color="D5DEE9"/>
+          <w:insideH w:val="single" w:sz="4" w:space="0" w:color="D5DEE9"/>
+          <w:insideV w:val="single" w:sz="4" w:space="0" w:color="D5DEE9"/>
+        </w:tblBorders>
+        <w:tblLayout w:type="fixed"/>
+        <w:tblCellMar>
+          <w:top w:w="60" w:type="dxa"/>
+          <w:left w:w="100" w:type="dxa"/>
+          <w:bottom w:w="60" w:type="dxa"/>
+          <w:right w:w="100" w:type="dxa"/>
+        </w:tblCellMar>
+      </w:tblPr>
+      <w:tblGrid>
+        <w:gridCol w:w="1862"/>
+        <w:gridCol w:w="5039"/>
+        <w:gridCol w:w="2737"/>
+      </w:tblGrid>
+      <w:tr>
+        <w:trPr>
+          <w:cantSplit/>
+          <w:tblHeader/>
+        </w:trPr>
+        <w:tc>
+          <w:tcPr>
+            <w:tcW w:type="dxa" w:w="1862"/>
+            <w:shd w:val="clear" w:color="auto" w:fill="E6ECF4"/>
+          </w:tcPr>
+          <w:p>
+            <w:pPr>
+              <w:spacing w:before="0" w:after="0"/>
+            </w:pPr>
+            <w:r>
+              <w:rPr>
+                <w:b/>
+                <w:sz w:val="20"/>
+              </w:rPr>
+              <w:t>Source</w:t>
+            </w:r>
+          </w:p>
+        </w:tc>
+        <w:tc>
+          <w:tcPr>
+            <w:tcW w:type="dxa" w:w="5039"/>
+            <w:shd w:val="clear" w:color="auto" w:fill="E6ECF4"/>
+          </w:tcPr>
+          <w:p>
+            <w:pPr>
+              <w:spacing w:before="0" w:after="0"/>
+            </w:pPr>
+            <w:r>
+              <w:rPr>
+                <w:b/>
+                <w:sz w:val="20"/>
+              </w:rPr>
+              <w:t>Real finding or rule</w:t>
+            </w:r>
+          </w:p>
+        </w:tc>
+        <w:tc>
+          <w:tcPr>
+            <w:tcW w:type="dxa" w:w="2737"/>
+            <w:shd w:val="clear" w:color="auto" w:fill="E6ECF4"/>
+          </w:tcPr>
+          <w:p>
+            <w:pPr>
+              <w:spacing w:before="0" w:after="0"/>
+            </w:pPr>
+            <w:r>
+              <w:rPr>
+                <w:b/>
+                <w:sz w:val="20"/>
+              </w:rPr>
+              <w:t>What it means for a screen</w:t>
+            </w:r>
+          </w:p>
+        </w:tc>
+      </w:tr>
+      <w:tr>
+        <w:trPr>
+          <w:cantSplit/>
+        </w:trPr>
+        <w:tc>
+          <w:tcPr>
+            <w:tcW w:type="dxa" w:w="1862"/>
+          </w:tcPr>
+          <w:p>
+            <w:pPr>
+              <w:spacing w:before="0" w:after="0"/>
+            </w:pPr>
+            <w:r>
+              <w:rPr>
+                <w:sz w:val="20"/>
+              </w:rPr>
+              <w:t>Mixed initiative</w:t>
+            </w:r>
+          </w:p>
+        </w:tc>
+        <w:tc>
+          <w:tcPr>
+            <w:tcW w:type="dxa" w:w="5039"/>
+          </w:tcPr>
+          <w:p>
+            <w:pPr>
+              <w:spacing w:before="0" w:after="0"/>
+            </w:pPr>
+            <w:r>
+              <w:rPr>
+                <w:sz w:val="20"/>
+              </w:rPr>
+              <w:t>Horvitz set out principles for interfaces in which the user and an automated service share the initiative, including acting only when the expected benefit outweighs the cost of a wrong action (Horvitz 1999).</w:t>
+            </w:r>
+          </w:p>
+        </w:tc>
+        <w:tc>
+          <w:tcPr>
+            <w:tcW w:type="dxa" w:w="2737"/>
+          </w:tcPr>
+          <w:p>
+            <w:pPr>
+              <w:spacing w:before="0" w:after="0"/>
+            </w:pPr>
+            <w:r>
+              <w:rPr>
+                <w:sz w:val="20"/>
+              </w:rPr>
+              <w:t>An intelligent suggestion has a price when it is wrong: weigh it before showing it.</w:t>
+            </w:r>
+          </w:p>
+        </w:tc>
+      </w:tr>
+      <w:tr>
+        <w:trPr>
+          <w:cantSplit/>
+        </w:trPr>
+        <w:tc>
+          <w:tcPr>
+            <w:tcW w:type="dxa" w:w="1862"/>
+          </w:tcPr>
+          <w:p>
+            <w:pPr>
+              <w:spacing w:before="0" w:after="0"/>
+            </w:pPr>
+            <w:r>
+              <w:rPr>
+                <w:sz w:val="20"/>
+              </w:rPr>
+              <w:t>Guidelines for human-AI interaction</w:t>
+            </w:r>
+          </w:p>
+        </w:tc>
+        <w:tc>
+          <w:tcPr>
+            <w:tcW w:type="dxa" w:w="5039"/>
+          </w:tcPr>
+          <w:p>
+            <w:pPr>
+              <w:spacing w:before="0" w:after="0"/>
+            </w:pPr>
+            <w:r>
+              <w:rPr>
+                <w:sz w:val="20"/>
+              </w:rPr>
+              <w:t>Amershi et al. distilled 18 guidelines, from more than 160 candidate recommendations, grouped by when they apply: initially, during interaction, when the system is wrong, and over time (Amershi et al. 2019).</w:t>
+            </w:r>
+          </w:p>
+        </w:tc>
+        <w:tc>
+          <w:tcPr>
+            <w:tcW w:type="dxa" w:w="2737"/>
+          </w:tcPr>
+          <w:p>
+            <w:pPr>
+              <w:spacing w:before="0" w:after="0"/>
+            </w:pPr>
+            <w:r>
+              <w:rPr>
+                <w:sz w:val="20"/>
+              </w:rPr>
+              <w:t>Check an intelligent feature in each of the four phases, not only in the demo.</w:t>
+            </w:r>
+          </w:p>
+        </w:tc>
+      </w:tr>
+      <w:tr>
+        <w:trPr>
+          <w:cantSplit/>
+        </w:trPr>
+        <w:tc>
+          <w:tcPr>
+            <w:tcW w:type="dxa" w:w="1862"/>
+          </w:tcPr>
+          <w:p>
+            <w:pPr>
+              <w:spacing w:before="0" w:after="0"/>
+            </w:pPr>
+            <w:r>
+              <w:rPr>
+                <w:sz w:val="20"/>
+              </w:rPr>
+              <w:t>Rule-based, adaptive, learning</w:t>
+            </w:r>
+          </w:p>
+        </w:tc>
+        <w:tc>
+          <w:tcPr>
+            <w:tcW w:type="dxa" w:w="5039"/>
+          </w:tcPr>
+          <w:p>
+            <w:pPr>
+              <w:spacing w:before="0" w:after="0"/>
+            </w:pPr>
+            <w:r>
+              <w:rPr>
+                <w:sz w:val="20"/>
+              </w:rPr>
+              <w:t>A rule is fixed and can be explained in a sentence; an adaptive system reacts to the situation now; a learning system draws on data about the person over time.</w:t>
+            </w:r>
+          </w:p>
+        </w:tc>
+        <w:tc>
+          <w:tcPr>
+            <w:tcW w:type="dxa" w:w="2737"/>
+          </w:tcPr>
+          <w:p>
+            <w:pPr>
+              <w:spacing w:before="0" w:after="0"/>
+            </w:pPr>
+            <w:r>
+              <w:rPr>
+                <w:sz w:val="20"/>
+              </w:rPr>
+              <w:t>Say which kind sits behind the screen: it decides what you can promise and explain.</w:t>
+            </w:r>
+          </w:p>
+        </w:tc>
+      </w:tr>
+    </w:tbl>
+    <w:p>
+      <w:pPr>
+        <w:spacing w:before="0" w:after="80"/>
+      </w:pPr>
+    </w:p>
     <w:tbl>
       <w:tblPr>
         <w:tblW w:w="9598" w:type="dxa"/>
@@ -2840,7 +3100,7 @@
             </w:pPr>
             <w:r>
               <w:rPr/>
-              <w:t>Northline Rail, Ilka, Mats, Saskia and Bram are made up for this example. When an automated service should act, ask or wait follows Horvitz (1999); making clear what a system can do and why it did something follows Amershi et al. (2019).</w:t>
+              <w:t>Northline Rail, Ilka, Mats, Saskia and Bram are made up for this example. When an automated service should act, ask or wait follows Horvitz (1999); making clear what a system can do and why it did something follows Amershi et al. (2019). The findings in the table of real evidence are real research results, rules and cases; the sources are listed below.</w:t>
             </w:r>
           </w:p>
         </w:tc>
@@ -3536,6 +3796,266 @@
         <w:spacing w:before="0" w:after="80"/>
       </w:pPr>
     </w:p>
+    <w:p>
+      <w:pPr>
+        <w:spacing w:before="0" w:after="100"/>
+      </w:pPr>
+      <w:r>
+        <w:rPr>
+          <w:b/>
+        </w:rPr>
+        <w:t>How AI guides, recommends and helps: a real platform and the rules</w:t>
+      </w:r>
+    </w:p>
+    <w:tbl>
+      <w:tblPr>
+        <w:tblW w:w="9638" w:type="dxa"/>
+        <w:tblBorders>
+          <w:top w:val="single" w:sz="4" w:space="0" w:color="D5DEE9"/>
+          <w:left w:val="single" w:sz="4" w:space="0" w:color="D5DEE9"/>
+          <w:bottom w:val="single" w:sz="4" w:space="0" w:color="D5DEE9"/>
+          <w:right w:val="single" w:sz="4" w:space="0" w:color="D5DEE9"/>
+          <w:insideH w:val="single" w:sz="4" w:space="0" w:color="D5DEE9"/>
+          <w:insideV w:val="single" w:sz="4" w:space="0" w:color="D5DEE9"/>
+        </w:tblBorders>
+        <w:tblLayout w:type="fixed"/>
+        <w:tblCellMar>
+          <w:top w:w="60" w:type="dxa"/>
+          <w:left w:w="100" w:type="dxa"/>
+          <w:bottom w:w="60" w:type="dxa"/>
+          <w:right w:w="100" w:type="dxa"/>
+        </w:tblCellMar>
+      </w:tblPr>
+      <w:tblGrid>
+        <w:gridCol w:w="2070"/>
+        <w:gridCol w:w="4806"/>
+        <w:gridCol w:w="2762"/>
+      </w:tblGrid>
+      <w:tr>
+        <w:trPr>
+          <w:cantSplit/>
+          <w:tblHeader/>
+        </w:trPr>
+        <w:tc>
+          <w:tcPr>
+            <w:tcW w:type="dxa" w:w="2070"/>
+            <w:shd w:val="clear" w:color="auto" w:fill="E6ECF4"/>
+          </w:tcPr>
+          <w:p>
+            <w:pPr>
+              <w:spacing w:before="0" w:after="0"/>
+            </w:pPr>
+            <w:r>
+              <w:rPr>
+                <w:b/>
+                <w:sz w:val="20"/>
+              </w:rPr>
+              <w:t>Topic</w:t>
+            </w:r>
+          </w:p>
+        </w:tc>
+        <w:tc>
+          <w:tcPr>
+            <w:tcW w:type="dxa" w:w="4806"/>
+            <w:shd w:val="clear" w:color="auto" w:fill="E6ECF4"/>
+          </w:tcPr>
+          <w:p>
+            <w:pPr>
+              <w:spacing w:before="0" w:after="0"/>
+            </w:pPr>
+            <w:r>
+              <w:rPr>
+                <w:b/>
+                <w:sz w:val="20"/>
+              </w:rPr>
+              <w:t>Real finding or example</w:t>
+            </w:r>
+          </w:p>
+        </w:tc>
+        <w:tc>
+          <w:tcPr>
+            <w:tcW w:type="dxa" w:w="2762"/>
+            <w:shd w:val="clear" w:color="auto" w:fill="E6ECF4"/>
+          </w:tcPr>
+          <w:p>
+            <w:pPr>
+              <w:spacing w:before="0" w:after="0"/>
+            </w:pPr>
+            <w:r>
+              <w:rPr>
+                <w:b/>
+                <w:sz w:val="20"/>
+              </w:rPr>
+              <w:t>What it means for a screen</w:t>
+            </w:r>
+          </w:p>
+        </w:tc>
+      </w:tr>
+      <w:tr>
+        <w:trPr>
+          <w:cantSplit/>
+        </w:trPr>
+        <w:tc>
+          <w:tcPr>
+            <w:tcW w:type="dxa" w:w="2070"/>
+          </w:tcPr>
+          <w:p>
+            <w:pPr>
+              <w:spacing w:before="0" w:after="0"/>
+            </w:pPr>
+            <w:r>
+              <w:rPr>
+                <w:sz w:val="20"/>
+              </w:rPr>
+              <w:t>Recommendation at scale</w:t>
+            </w:r>
+          </w:p>
+        </w:tc>
+        <w:tc>
+          <w:tcPr>
+            <w:tcW w:type="dxa" w:w="4806"/>
+          </w:tcPr>
+          <w:p>
+            <w:pPr>
+              <w:spacing w:before="0" w:after="0"/>
+            </w:pPr>
+            <w:r>
+              <w:rPr>
+                <w:sz w:val="20"/>
+              </w:rPr>
+              <w:t>Netflix reported that its recommender influences the choice for about 80% of the hours streamed, and the rest comes from search; the company also estimated the value of personalisation and recommendations at over one billion dollars a year (Gomez-Uribe and Hunt 2015; the figures are the company's own).</w:t>
+            </w:r>
+          </w:p>
+        </w:tc>
+        <w:tc>
+          <w:tcPr>
+            <w:tcW w:type="dxa" w:w="2762"/>
+          </w:tcPr>
+          <w:p>
+            <w:pPr>
+              <w:spacing w:before="0" w:after="0"/>
+            </w:pPr>
+            <w:r>
+              <w:rPr>
+                <w:sz w:val="20"/>
+              </w:rPr>
+              <w:t>A recommendation is not a side feature: on a large platform it is the main way into the content.</w:t>
+            </w:r>
+          </w:p>
+        </w:tc>
+      </w:tr>
+      <w:tr>
+        <w:trPr>
+          <w:cantSplit/>
+        </w:trPr>
+        <w:tc>
+          <w:tcPr>
+            <w:tcW w:type="dxa" w:w="2070"/>
+          </w:tcPr>
+          <w:p>
+            <w:pPr>
+              <w:spacing w:before="0" w:after="0"/>
+            </w:pPr>
+            <w:r>
+              <w:rPr>
+                <w:sz w:val="20"/>
+              </w:rPr>
+              <w:t>Context and data</w:t>
+            </w:r>
+          </w:p>
+        </w:tc>
+        <w:tc>
+          <w:tcPr>
+            <w:tcW w:type="dxa" w:w="4806"/>
+          </w:tcPr>
+          <w:p>
+            <w:pPr>
+              <w:spacing w:before="0" w:after="0"/>
+            </w:pPr>
+            <w:r>
+              <w:rPr>
+                <w:sz w:val="20"/>
+              </w:rPr>
+              <w:t>Guidelines ask a system to make clear what it can do and how well it can do it, to match social norms, and to time its services by the person's context (Amershi et al. 2019).</w:t>
+            </w:r>
+          </w:p>
+        </w:tc>
+        <w:tc>
+          <w:tcPr>
+            <w:tcW w:type="dxa" w:w="2762"/>
+          </w:tcPr>
+          <w:p>
+            <w:pPr>
+              <w:spacing w:before="0" w:after="0"/>
+            </w:pPr>
+            <w:r>
+              <w:rPr>
+                <w:sz w:val="20"/>
+              </w:rPr>
+              <w:t>Show the person what the assistant knows and does not know.</w:t>
+            </w:r>
+          </w:p>
+        </w:tc>
+      </w:tr>
+      <w:tr>
+        <w:trPr>
+          <w:cantSplit/>
+        </w:trPr>
+        <w:tc>
+          <w:tcPr>
+            <w:tcW w:type="dxa" w:w="2070"/>
+          </w:tcPr>
+          <w:p>
+            <w:pPr>
+              <w:spacing w:before="0" w:after="0"/>
+            </w:pPr>
+            <w:r>
+              <w:rPr>
+                <w:sz w:val="20"/>
+              </w:rPr>
+              <w:t>Steering the dialogue</w:t>
+            </w:r>
+          </w:p>
+        </w:tc>
+        <w:tc>
+          <w:tcPr>
+            <w:tcW w:type="dxa" w:w="4806"/>
+          </w:tcPr>
+          <w:p>
+            <w:pPr>
+              <w:spacing w:before="0" w:after="0"/>
+            </w:pPr>
+            <w:r>
+              <w:rPr>
+                <w:sz w:val="20"/>
+              </w:rPr>
+              <w:t>A system that acts on a guess should be easy to dismiss (Amershi et al. 2019).</w:t>
+            </w:r>
+          </w:p>
+        </w:tc>
+        <w:tc>
+          <w:tcPr>
+            <w:tcW w:type="dxa" w:w="2762"/>
+          </w:tcPr>
+          <w:p>
+            <w:pPr>
+              <w:spacing w:before="0" w:after="0"/>
+            </w:pPr>
+            <w:r>
+              <w:rPr>
+                <w:sz w:val="20"/>
+              </w:rPr>
+              <w:t>Give every guess a one-tap way out.</w:t>
+            </w:r>
+          </w:p>
+        </w:tc>
+      </w:tr>
+    </w:tbl>
+    <w:p>
+      <w:pPr>
+        <w:spacing w:before="0" w:after="80"/>
+      </w:pPr>
+    </w:p>
     <w:tbl>
       <w:tblPr>
         <w:tblW w:w="9598" w:type="dxa"/>
@@ -3585,7 +4105,7 @@
             </w:pPr>
             <w:r>
               <w:rPr/>
-              <w:t>Northline Rail, Ilka, Mats, Saskia and Bram are made up for this example. People reacting to an AI's agency, as convenient or intrusive depending on control, follows Sundar (2020). Voice interfaces go deeper on Day 11.</w:t>
+              <w:t>Northline Rail, Ilka, Mats, Saskia and Bram are made up for this example. People reacting to an AI's agency, as convenient or intrusive depending on control, follows Sundar (2020). Voice interfaces go deeper on Day 11. The findings in the table of real evidence are real research results, rules and cases; the sources are listed below.</w:t>
             </w:r>
           </w:p>
         </w:tc>
@@ -3774,7 +4294,7 @@
           <w:color w:val="556274"/>
           <w:sz w:val="18"/>
         </w:rPr>
-        <w:t>Amershi et al. 2019 · Horvitz 1999 · Sundar 2020</w:t>
+        <w:t>Amershi et al. 2019 · Horvitz 1999 · Sundar 2020 · Gomez-Uribe &amp; Hunt 2015</w:t>
       </w:r>
     </w:p>
     <w:p>
@@ -4419,6 +4939,319 @@
         <w:spacing w:before="0" w:after="80"/>
       </w:pPr>
     </w:p>
+    <w:p>
+      <w:pPr>
+        <w:spacing w:before="0" w:after="100"/>
+      </w:pPr>
+      <w:r>
+        <w:rPr>
+          <w:b/>
+        </w:rPr>
+        <w:t>What intelligent interfaces give, and how they go wrong: evidence</w:t>
+      </w:r>
+    </w:p>
+    <w:tbl>
+      <w:tblPr>
+        <w:tblW w:w="9638" w:type="dxa"/>
+        <w:tblBorders>
+          <w:top w:val="single" w:sz="4" w:space="0" w:color="D5DEE9"/>
+          <w:left w:val="single" w:sz="4" w:space="0" w:color="D5DEE9"/>
+          <w:bottom w:val="single" w:sz="4" w:space="0" w:color="D5DEE9"/>
+          <w:right w:val="single" w:sz="4" w:space="0" w:color="D5DEE9"/>
+          <w:insideH w:val="single" w:sz="4" w:space="0" w:color="D5DEE9"/>
+          <w:insideV w:val="single" w:sz="4" w:space="0" w:color="D5DEE9"/>
+        </w:tblBorders>
+        <w:tblLayout w:type="fixed"/>
+        <w:tblCellMar>
+          <w:top w:w="60" w:type="dxa"/>
+          <w:left w:w="100" w:type="dxa"/>
+          <w:bottom w:w="60" w:type="dxa"/>
+          <w:right w:w="100" w:type="dxa"/>
+        </w:tblCellMar>
+      </w:tblPr>
+      <w:tblGrid>
+        <w:gridCol w:w="1622"/>
+        <w:gridCol w:w="4568"/>
+        <w:gridCol w:w="3448"/>
+      </w:tblGrid>
+      <w:tr>
+        <w:trPr>
+          <w:cantSplit/>
+          <w:tblHeader/>
+        </w:trPr>
+        <w:tc>
+          <w:tcPr>
+            <w:tcW w:type="dxa" w:w="1622"/>
+            <w:shd w:val="clear" w:color="auto" w:fill="E6ECF4"/>
+          </w:tcPr>
+          <w:p>
+            <w:pPr>
+              <w:spacing w:before="0" w:after="0"/>
+            </w:pPr>
+            <w:r>
+              <w:rPr>
+                <w:b/>
+                <w:sz w:val="20"/>
+              </w:rPr>
+              <w:t>Topic</w:t>
+            </w:r>
+          </w:p>
+        </w:tc>
+        <w:tc>
+          <w:tcPr>
+            <w:tcW w:type="dxa" w:w="4568"/>
+            <w:shd w:val="clear" w:color="auto" w:fill="E6ECF4"/>
+          </w:tcPr>
+          <w:p>
+            <w:pPr>
+              <w:spacing w:before="0" w:after="0"/>
+            </w:pPr>
+            <w:r>
+              <w:rPr>
+                <w:b/>
+                <w:sz w:val="20"/>
+              </w:rPr>
+              <w:t>Real finding</w:t>
+            </w:r>
+          </w:p>
+        </w:tc>
+        <w:tc>
+          <w:tcPr>
+            <w:tcW w:type="dxa" w:w="3448"/>
+            <w:shd w:val="clear" w:color="auto" w:fill="E6ECF4"/>
+          </w:tcPr>
+          <w:p>
+            <w:pPr>
+              <w:spacing w:before="0" w:after="0"/>
+            </w:pPr>
+            <w:r>
+              <w:rPr>
+                <w:b/>
+                <w:sz w:val="20"/>
+              </w:rPr>
+              <w:t>What it means for a screen</w:t>
+            </w:r>
+          </w:p>
+        </w:tc>
+      </w:tr>
+      <w:tr>
+        <w:trPr>
+          <w:cantSplit/>
+        </w:trPr>
+        <w:tc>
+          <w:tcPr>
+            <w:tcW w:type="dxa" w:w="1622"/>
+          </w:tcPr>
+          <w:p>
+            <w:pPr>
+              <w:spacing w:before="0" w:after="0"/>
+            </w:pPr>
+            <w:r>
+              <w:rPr>
+                <w:sz w:val="20"/>
+              </w:rPr>
+              <w:t>A narrowed view</w:t>
+            </w:r>
+          </w:p>
+        </w:tc>
+        <w:tc>
+          <w:tcPr>
+            <w:tcW w:type="dxa" w:w="4568"/>
+          </w:tcPr>
+          <w:p>
+            <w:pPr>
+              <w:spacing w:before="0" w:after="0"/>
+            </w:pPr>
+            <w:r>
+              <w:rPr>
+                <w:sz w:val="20"/>
+              </w:rPr>
+              <w:t>In a study of 10.1 million US Facebook users, the ranking algorithm reduced the share of ideologically cross-cutting content that users saw by about 5% for conservatives and 8% for liberals; the users' own clicks reduced it by about 17% and 6% (Bakshy et al. 2015, as reported).</w:t>
+            </w:r>
+          </w:p>
+        </w:tc>
+        <w:tc>
+          <w:tcPr>
+            <w:tcW w:type="dxa" w:w="3448"/>
+          </w:tcPr>
+          <w:p>
+            <w:pPr>
+              <w:spacing w:before="0" w:after="0"/>
+            </w:pPr>
+            <w:r>
+              <w:rPr>
+                <w:sz w:val="20"/>
+              </w:rPr>
+              <w:t>A system narrows the view in two ways: by what it ranks and by what people choose from it; measure both.</w:t>
+            </w:r>
+          </w:p>
+        </w:tc>
+      </w:tr>
+      <w:tr>
+        <w:trPr>
+          <w:cantSplit/>
+        </w:trPr>
+        <w:tc>
+          <w:tcPr>
+            <w:tcW w:type="dxa" w:w="1622"/>
+          </w:tcPr>
+          <w:p>
+            <w:pPr>
+              <w:spacing w:before="0" w:after="0"/>
+            </w:pPr>
+            <w:r>
+              <w:rPr>
+                <w:sz w:val="20"/>
+              </w:rPr>
+              <w:t>The filter bubble claim</w:t>
+            </w:r>
+          </w:p>
+        </w:tc>
+        <w:tc>
+          <w:tcPr>
+            <w:tcW w:type="dxa" w:w="4568"/>
+          </w:tcPr>
+          <w:p>
+            <w:pPr>
+              <w:spacing w:before="0" w:after="0"/>
+            </w:pPr>
+            <w:r>
+              <w:rPr>
+                <w:sz w:val="20"/>
+              </w:rPr>
+              <w:t>Eli Pariser warned that personalisation could lock people into a view of their own (Pariser 2011); the size of the effect is contested, as the study above shows.</w:t>
+            </w:r>
+          </w:p>
+        </w:tc>
+        <w:tc>
+          <w:tcPr>
+            <w:tcW w:type="dxa" w:w="3448"/>
+          </w:tcPr>
+          <w:p>
+            <w:pPr>
+              <w:spacing w:before="0" w:after="0"/>
+            </w:pPr>
+            <w:r>
+              <w:rPr>
+                <w:sz w:val="20"/>
+              </w:rPr>
+              <w:t>Treat over-personalisation as a risk to test, not as a certainty.</w:t>
+            </w:r>
+          </w:p>
+        </w:tc>
+      </w:tr>
+      <w:tr>
+        <w:trPr>
+          <w:cantSplit/>
+        </w:trPr>
+        <w:tc>
+          <w:tcPr>
+            <w:tcW w:type="dxa" w:w="1622"/>
+          </w:tcPr>
+          <w:p>
+            <w:pPr>
+              <w:spacing w:before="0" w:after="0"/>
+            </w:pPr>
+            <w:r>
+              <w:rPr>
+                <w:sz w:val="20"/>
+              </w:rPr>
+              <w:t>Use and misuse of automation</w:t>
+            </w:r>
+          </w:p>
+        </w:tc>
+        <w:tc>
+          <w:tcPr>
+            <w:tcW w:type="dxa" w:w="4568"/>
+          </w:tcPr>
+          <w:p>
+            <w:pPr>
+              <w:spacing w:before="0" w:after="0"/>
+            </w:pPr>
+            <w:r>
+              <w:rPr>
+                <w:sz w:val="20"/>
+              </w:rPr>
+              <w:t>Parasuraman and Riley described the use, misuse, disuse and abuse of automation: people rely on it too much or reject it, depending on how well it matches their trust (Parasuraman and Riley 1997).</w:t>
+            </w:r>
+          </w:p>
+        </w:tc>
+        <w:tc>
+          <w:tcPr>
+            <w:tcW w:type="dxa" w:w="3448"/>
+          </w:tcPr>
+          <w:p>
+            <w:pPr>
+              <w:spacing w:before="0" w:after="0"/>
+            </w:pPr>
+            <w:r>
+              <w:rPr>
+                <w:sz w:val="20"/>
+              </w:rPr>
+              <w:t>Design for calibrated trust, not for maximum use.</w:t>
+            </w:r>
+          </w:p>
+        </w:tc>
+      </w:tr>
+      <w:tr>
+        <w:trPr>
+          <w:cantSplit/>
+        </w:trPr>
+        <w:tc>
+          <w:tcPr>
+            <w:tcW w:type="dxa" w:w="1622"/>
+          </w:tcPr>
+          <w:p>
+            <w:pPr>
+              <w:spacing w:before="0" w:after="0"/>
+            </w:pPr>
+            <w:r>
+              <w:rPr>
+                <w:sz w:val="20"/>
+              </w:rPr>
+              <w:t>Trust in automation</w:t>
+            </w:r>
+          </w:p>
+        </w:tc>
+        <w:tc>
+          <w:tcPr>
+            <w:tcW w:type="dxa" w:w="4568"/>
+          </w:tcPr>
+          <w:p>
+            <w:pPr>
+              <w:spacing w:before="0" w:after="0"/>
+            </w:pPr>
+            <w:r>
+              <w:rPr>
+                <w:sz w:val="20"/>
+              </w:rPr>
+              <w:t>Trust should follow the actual reliability of the system; trust that is too high or too low leads to error (Lee and See 2004).</w:t>
+            </w:r>
+          </w:p>
+        </w:tc>
+        <w:tc>
+          <w:tcPr>
+            <w:tcW w:type="dxa" w:w="3448"/>
+          </w:tcPr>
+          <w:p>
+            <w:pPr>
+              <w:spacing w:before="0" w:after="0"/>
+            </w:pPr>
+            <w:r>
+              <w:rPr>
+                <w:sz w:val="20"/>
+              </w:rPr>
+              <w:t>Show reliability honestly, and let the person see when the system is unsure.</w:t>
+            </w:r>
+          </w:p>
+        </w:tc>
+      </w:tr>
+    </w:tbl>
+    <w:p>
+      <w:pPr>
+        <w:spacing w:before="0" w:after="80"/>
+      </w:pPr>
+    </w:p>
     <w:tbl>
       <w:tblPr>
         <w:tblW w:w="9598" w:type="dxa"/>
@@ -4468,7 +5301,7 @@
             </w:pPr>
             <w:r>
               <w:rPr/>
-              <w:t>Northline Rail, Ilka, Mats, Saskia and Bram are made up for this example. Personalisation narrowing what people see follows Pariser (2011); people abandoning automation after visible failures follows Parasuraman and Riley (1997); trust that should match what a system can do follows Lee and See (2004).</w:t>
+              <w:t>Northline Rail, Ilka, Mats, Saskia and Bram are made up for this example. Personalisation narrowing what people see follows Pariser (2011); people abandoning automation after visible failures follows Parasuraman and Riley (1997); trust that should match what a system can do follows Lee and See (2004). The findings in the table of real evidence are real research results, rules and cases; the sources are listed below.</w:t>
             </w:r>
           </w:p>
         </w:tc>
@@ -4657,7 +5490,7 @@
           <w:color w:val="556274"/>
           <w:sz w:val="18"/>
         </w:rPr>
-        <w:t>Pariser 2011 · Parasuraman &amp; Riley 1997 · Lee &amp; See 2004</w:t>
+        <w:t>Pariser 2011 · Parasuraman &amp; Riley 1997 · Lee &amp; See 2004 · Bakshy et al. 2015</w:t>
       </w:r>
     </w:p>
     <w:p>
@@ -5164,6 +5997,319 @@
         <w:spacing w:before="0" w:after="80"/>
       </w:pPr>
     </w:p>
+    <w:p>
+      <w:pPr>
+        <w:spacing w:before="0" w:after="100"/>
+      </w:pPr>
+      <w:r>
+        <w:rPr>
+          <w:b/>
+        </w:rPr>
+        <w:t>Transparency, control and undo: guidelines and rules</w:t>
+      </w:r>
+    </w:p>
+    <w:tbl>
+      <w:tblPr>
+        <w:tblW w:w="9638" w:type="dxa"/>
+        <w:tblBorders>
+          <w:top w:val="single" w:sz="4" w:space="0" w:color="D5DEE9"/>
+          <w:left w:val="single" w:sz="4" w:space="0" w:color="D5DEE9"/>
+          <w:bottom w:val="single" w:sz="4" w:space="0" w:color="D5DEE9"/>
+          <w:right w:val="single" w:sz="4" w:space="0" w:color="D5DEE9"/>
+          <w:insideH w:val="single" w:sz="4" w:space="0" w:color="D5DEE9"/>
+          <w:insideV w:val="single" w:sz="4" w:space="0" w:color="D5DEE9"/>
+        </w:tblBorders>
+        <w:tblLayout w:type="fixed"/>
+        <w:tblCellMar>
+          <w:top w:w="60" w:type="dxa"/>
+          <w:left w:w="100" w:type="dxa"/>
+          <w:bottom w:w="60" w:type="dxa"/>
+          <w:right w:w="100" w:type="dxa"/>
+        </w:tblCellMar>
+      </w:tblPr>
+      <w:tblGrid>
+        <w:gridCol w:w="1463"/>
+        <w:gridCol w:w="5557"/>
+        <w:gridCol w:w="2618"/>
+      </w:tblGrid>
+      <w:tr>
+        <w:trPr>
+          <w:cantSplit/>
+          <w:tblHeader/>
+        </w:trPr>
+        <w:tc>
+          <w:tcPr>
+            <w:tcW w:type="dxa" w:w="1463"/>
+            <w:shd w:val="clear" w:color="auto" w:fill="E6ECF4"/>
+          </w:tcPr>
+          <w:p>
+            <w:pPr>
+              <w:spacing w:before="0" w:after="0"/>
+            </w:pPr>
+            <w:r>
+              <w:rPr>
+                <w:b/>
+                <w:sz w:val="20"/>
+              </w:rPr>
+              <w:t>Question</w:t>
+            </w:r>
+          </w:p>
+        </w:tc>
+        <w:tc>
+          <w:tcPr>
+            <w:tcW w:type="dxa" w:w="5557"/>
+            <w:shd w:val="clear" w:color="auto" w:fill="E6ECF4"/>
+          </w:tcPr>
+          <w:p>
+            <w:pPr>
+              <w:spacing w:before="0" w:after="0"/>
+            </w:pPr>
+            <w:r>
+              <w:rPr>
+                <w:b/>
+                <w:sz w:val="20"/>
+              </w:rPr>
+              <w:t>Real guideline or rule</w:t>
+            </w:r>
+          </w:p>
+        </w:tc>
+        <w:tc>
+          <w:tcPr>
+            <w:tcW w:type="dxa" w:w="2618"/>
+            <w:shd w:val="clear" w:color="auto" w:fill="E6ECF4"/>
+          </w:tcPr>
+          <w:p>
+            <w:pPr>
+              <w:spacing w:before="0" w:after="0"/>
+            </w:pPr>
+            <w:r>
+              <w:rPr>
+                <w:b/>
+                <w:sz w:val="20"/>
+              </w:rPr>
+              <w:t>What it means for a screen</w:t>
+            </w:r>
+          </w:p>
+        </w:tc>
+      </w:tr>
+      <w:tr>
+        <w:trPr>
+          <w:cantSplit/>
+        </w:trPr>
+        <w:tc>
+          <w:tcPr>
+            <w:tcW w:type="dxa" w:w="1463"/>
+          </w:tcPr>
+          <w:p>
+            <w:pPr>
+              <w:spacing w:before="0" w:after="0"/>
+            </w:pPr>
+            <w:r>
+              <w:rPr>
+                <w:sz w:val="20"/>
+              </w:rPr>
+              <w:t>Can I see why?</w:t>
+            </w:r>
+          </w:p>
+        </w:tc>
+        <w:tc>
+          <w:tcPr>
+            <w:tcW w:type="dxa" w:w="5557"/>
+          </w:tcPr>
+          <w:p>
+            <w:pPr>
+              <w:spacing w:before="0" w:after="0"/>
+            </w:pPr>
+            <w:r>
+              <w:rPr>
+                <w:sz w:val="20"/>
+              </w:rPr>
+              <w:t>One of the guidelines asks to make clear why the system did what it did (Amershi et al. 2019). Under the GDPR, people can ask for meaningful information about the logic of an automated decision.</w:t>
+            </w:r>
+          </w:p>
+        </w:tc>
+        <w:tc>
+          <w:tcPr>
+            <w:tcW w:type="dxa" w:w="2618"/>
+          </w:tcPr>
+          <w:p>
+            <w:pPr>
+              <w:spacing w:before="0" w:after="0"/>
+            </w:pPr>
+            <w:r>
+              <w:rPr>
+                <w:sz w:val="20"/>
+              </w:rPr>
+              <w:t>State the reason in one sentence next to the suggestion.</w:t>
+            </w:r>
+          </w:p>
+        </w:tc>
+      </w:tr>
+      <w:tr>
+        <w:trPr>
+          <w:cantSplit/>
+        </w:trPr>
+        <w:tc>
+          <w:tcPr>
+            <w:tcW w:type="dxa" w:w="1463"/>
+          </w:tcPr>
+          <w:p>
+            <w:pPr>
+              <w:spacing w:before="0" w:after="0"/>
+            </w:pPr>
+            <w:r>
+              <w:rPr>
+                <w:sz w:val="20"/>
+              </w:rPr>
+              <w:t>Can I change it?</w:t>
+            </w:r>
+          </w:p>
+        </w:tc>
+        <w:tc>
+          <w:tcPr>
+            <w:tcW w:type="dxa" w:w="5557"/>
+          </w:tcPr>
+          <w:p>
+            <w:pPr>
+              <w:spacing w:before="0" w:after="0"/>
+            </w:pPr>
+            <w:r>
+              <w:rPr>
+                <w:sz w:val="20"/>
+              </w:rPr>
+              <w:t>The guidelines ask to support efficient correction and to encourage granular feedback (Amershi et al. 2019).</w:t>
+            </w:r>
+          </w:p>
+        </w:tc>
+        <w:tc>
+          <w:tcPr>
+            <w:tcW w:type="dxa" w:w="2618"/>
+          </w:tcPr>
+          <w:p>
+            <w:pPr>
+              <w:spacing w:before="0" w:after="0"/>
+            </w:pPr>
+            <w:r>
+              <w:rPr>
+                <w:sz w:val="20"/>
+              </w:rPr>
+              <w:t>Offer other options at the point of decision, not in a settings page.</w:t>
+            </w:r>
+          </w:p>
+        </w:tc>
+      </w:tr>
+      <w:tr>
+        <w:trPr>
+          <w:cantSplit/>
+        </w:trPr>
+        <w:tc>
+          <w:tcPr>
+            <w:tcW w:type="dxa" w:w="1463"/>
+          </w:tcPr>
+          <w:p>
+            <w:pPr>
+              <w:spacing w:before="0" w:after="0"/>
+            </w:pPr>
+            <w:r>
+              <w:rPr>
+                <w:sz w:val="20"/>
+              </w:rPr>
+              <w:t>Can I undo it?</w:t>
+            </w:r>
+          </w:p>
+        </w:tc>
+        <w:tc>
+          <w:tcPr>
+            <w:tcW w:type="dxa" w:w="5557"/>
+          </w:tcPr>
+          <w:p>
+            <w:pPr>
+              <w:spacing w:before="0" w:after="0"/>
+            </w:pPr>
+            <w:r>
+              <w:rPr>
+                <w:sz w:val="20"/>
+              </w:rPr>
+              <w:t>The guidelines ask for global controls over what the system monitors and how it behaves (Amershi et al. 2019). Article 22 of the GDPR gives people a right not to be subject to a decision based solely on automated processing with legal or similarly significant effects, with safeguards such as human intervention and the right to contest it.</w:t>
+            </w:r>
+          </w:p>
+        </w:tc>
+        <w:tc>
+          <w:tcPr>
+            <w:tcW w:type="dxa" w:w="2618"/>
+          </w:tcPr>
+          <w:p>
+            <w:pPr>
+              <w:spacing w:before="0" w:after="0"/>
+            </w:pPr>
+            <w:r>
+              <w:rPr>
+                <w:sz w:val="20"/>
+              </w:rPr>
+              <w:t>Make undo one tap, and give a human route for decisions that matter.</w:t>
+            </w:r>
+          </w:p>
+        </w:tc>
+      </w:tr>
+      <w:tr>
+        <w:trPr>
+          <w:cantSplit/>
+        </w:trPr>
+        <w:tc>
+          <w:tcPr>
+            <w:tcW w:type="dxa" w:w="1463"/>
+          </w:tcPr>
+          <w:p>
+            <w:pPr>
+              <w:spacing w:before="0" w:after="0"/>
+            </w:pPr>
+            <w:r>
+              <w:rPr>
+                <w:sz w:val="20"/>
+              </w:rPr>
+              <w:t>Do I know it is a machine?</w:t>
+            </w:r>
+          </w:p>
+        </w:tc>
+        <w:tc>
+          <w:tcPr>
+            <w:tcW w:type="dxa" w:w="5557"/>
+          </w:tcPr>
+          <w:p>
+            <w:pPr>
+              <w:spacing w:before="0" w:after="0"/>
+            </w:pPr>
+            <w:r>
+              <w:rPr>
+                <w:sz w:val="20"/>
+              </w:rPr>
+              <w:t>The EU AI Act (Article 50) requires that people are told when they are interacting with an AI system, unless that is obvious from the context.</w:t>
+            </w:r>
+          </w:p>
+        </w:tc>
+        <w:tc>
+          <w:tcPr>
+            <w:tcW w:type="dxa" w:w="2618"/>
+          </w:tcPr>
+          <w:p>
+            <w:pPr>
+              <w:spacing w:before="0" w:after="0"/>
+            </w:pPr>
+            <w:r>
+              <w:rPr>
+                <w:sz w:val="20"/>
+              </w:rPr>
+              <w:t>Label the assistant and say what it is.</w:t>
+            </w:r>
+          </w:p>
+        </w:tc>
+      </w:tr>
+    </w:tbl>
+    <w:p>
+      <w:pPr>
+        <w:spacing w:before="0" w:after="80"/>
+      </w:pPr>
+    </w:p>
     <w:tbl>
       <w:tblPr>
         <w:tblW w:w="9598" w:type="dxa"/>
@@ -5213,7 +6359,7 @@
             </w:pPr>
             <w:r>
               <w:rPr/>
-              <w:t>Northline Rail, Ilka, Mats, Saskia and Bram are made up for this example. Showing why, supporting dismissal and correction follows Amershi et al. (2019); perceived control shaping how people feel about automation follows Sundar (2020).</w:t>
+              <w:t>Northline Rail, Ilka, Mats, Saskia and Bram are made up for this example. Showing why, supporting dismissal and correction follows Amershi et al. (2019); perceived control shaping how people feel about automation follows Sundar (2020). The findings in the table of real evidence are real research results, rules and cases; the sources are listed below.</w:t>
             </w:r>
           </w:p>
         </w:tc>
@@ -5402,7 +6548,7 @@
           <w:color w:val="556274"/>
           <w:sz w:val="18"/>
         </w:rPr>
-        <w:t>Amershi et al. 2019 · Lee &amp; See 2004 · Sundar 2020</w:t>
+        <w:t>Amershi et al. 2019 · Lee &amp; See 2004 · Sundar 2020 · GDPR · EU AI Act 2024</w:t>
       </w:r>
     </w:p>
     <w:p>
@@ -5637,6 +6783,266 @@
         <w:t>Figure 6 · Northline weighs three measures on effect on users, feasibility, risk and time pressure.</w:t>
       </w:r>
     </w:p>
+    <w:p>
+      <w:pPr>
+        <w:spacing w:before="0" w:after="100"/>
+      </w:pPr>
+      <w:r>
+        <w:rPr>
+          <w:b/>
+        </w:rPr>
+        <w:t>Data, context and situation: findings</w:t>
+      </w:r>
+    </w:p>
+    <w:tbl>
+      <w:tblPr>
+        <w:tblW w:w="9638" w:type="dxa"/>
+        <w:tblBorders>
+          <w:top w:val="single" w:sz="4" w:space="0" w:color="D5DEE9"/>
+          <w:left w:val="single" w:sz="4" w:space="0" w:color="D5DEE9"/>
+          <w:bottom w:val="single" w:sz="4" w:space="0" w:color="D5DEE9"/>
+          <w:right w:val="single" w:sz="4" w:space="0" w:color="D5DEE9"/>
+          <w:insideH w:val="single" w:sz="4" w:space="0" w:color="D5DEE9"/>
+          <w:insideV w:val="single" w:sz="4" w:space="0" w:color="D5DEE9"/>
+        </w:tblBorders>
+        <w:tblLayout w:type="fixed"/>
+        <w:tblCellMar>
+          <w:top w:w="60" w:type="dxa"/>
+          <w:left w:w="100" w:type="dxa"/>
+          <w:bottom w:w="60" w:type="dxa"/>
+          <w:right w:w="100" w:type="dxa"/>
+        </w:tblCellMar>
+      </w:tblPr>
+      <w:tblGrid>
+        <w:gridCol w:w="1929"/>
+        <w:gridCol w:w="4509"/>
+        <w:gridCol w:w="3200"/>
+      </w:tblGrid>
+      <w:tr>
+        <w:trPr>
+          <w:cantSplit/>
+          <w:tblHeader/>
+        </w:trPr>
+        <w:tc>
+          <w:tcPr>
+            <w:tcW w:type="dxa" w:w="1929"/>
+            <w:shd w:val="clear" w:color="auto" w:fill="E6ECF4"/>
+          </w:tcPr>
+          <w:p>
+            <w:pPr>
+              <w:spacing w:before="0" w:after="0"/>
+            </w:pPr>
+            <w:r>
+              <w:rPr>
+                <w:b/>
+                <w:sz w:val="20"/>
+              </w:rPr>
+              <w:t>Topic</w:t>
+            </w:r>
+          </w:p>
+        </w:tc>
+        <w:tc>
+          <w:tcPr>
+            <w:tcW w:type="dxa" w:w="4509"/>
+            <w:shd w:val="clear" w:color="auto" w:fill="E6ECF4"/>
+          </w:tcPr>
+          <w:p>
+            <w:pPr>
+              <w:spacing w:before="0" w:after="0"/>
+            </w:pPr>
+            <w:r>
+              <w:rPr>
+                <w:b/>
+                <w:sz w:val="20"/>
+              </w:rPr>
+              <w:t>Real finding</w:t>
+            </w:r>
+          </w:p>
+        </w:tc>
+        <w:tc>
+          <w:tcPr>
+            <w:tcW w:type="dxa" w:w="3200"/>
+            <w:shd w:val="clear" w:color="auto" w:fill="E6ECF4"/>
+          </w:tcPr>
+          <w:p>
+            <w:pPr>
+              <w:spacing w:before="0" w:after="0"/>
+            </w:pPr>
+            <w:r>
+              <w:rPr>
+                <w:b/>
+                <w:sz w:val="20"/>
+              </w:rPr>
+              <w:t>What it means for a measure</w:t>
+            </w:r>
+          </w:p>
+        </w:tc>
+      </w:tr>
+      <w:tr>
+        <w:trPr>
+          <w:cantSplit/>
+        </w:trPr>
+        <w:tc>
+          <w:tcPr>
+            <w:tcW w:type="dxa" w:w="1929"/>
+          </w:tcPr>
+          <w:p>
+            <w:pPr>
+              <w:spacing w:before="0" w:after="0"/>
+            </w:pPr>
+            <w:r>
+              <w:rPr>
+                <w:sz w:val="20"/>
+              </w:rPr>
+              <w:t>Trust follows reliability</w:t>
+            </w:r>
+          </w:p>
+        </w:tc>
+        <w:tc>
+          <w:tcPr>
+            <w:tcW w:type="dxa" w:w="4509"/>
+          </w:tcPr>
+          <w:p>
+            <w:pPr>
+              <w:spacing w:before="0" w:after="0"/>
+            </w:pPr>
+            <w:r>
+              <w:rPr>
+                <w:sz w:val="20"/>
+              </w:rPr>
+              <w:t>Trust should be calibrated to how reliable the automation really is (Lee and See 2004).</w:t>
+            </w:r>
+          </w:p>
+        </w:tc>
+        <w:tc>
+          <w:tcPr>
+            <w:tcW w:type="dxa" w:w="3200"/>
+          </w:tcPr>
+          <w:p>
+            <w:pPr>
+              <w:spacing w:before="0" w:after="0"/>
+            </w:pPr>
+            <w:r>
+              <w:rPr>
+                <w:sz w:val="20"/>
+              </w:rPr>
+              <w:t>Measure how often the suggestion is right, and show people the result.</w:t>
+            </w:r>
+          </w:p>
+        </w:tc>
+      </w:tr>
+      <w:tr>
+        <w:trPr>
+          <w:cantSplit/>
+        </w:trPr>
+        <w:tc>
+          <w:tcPr>
+            <w:tcW w:type="dxa" w:w="1929"/>
+          </w:tcPr>
+          <w:p>
+            <w:pPr>
+              <w:spacing w:before="0" w:after="0"/>
+            </w:pPr>
+            <w:r>
+              <w:rPr>
+                <w:sz w:val="20"/>
+              </w:rPr>
+              <w:t>Misuse and disuse</w:t>
+            </w:r>
+          </w:p>
+        </w:tc>
+        <w:tc>
+          <w:tcPr>
+            <w:tcW w:type="dxa" w:w="4509"/>
+          </w:tcPr>
+          <w:p>
+            <w:pPr>
+              <w:spacing w:before="0" w:after="0"/>
+            </w:pPr>
+            <w:r>
+              <w:rPr>
+                <w:sz w:val="20"/>
+              </w:rPr>
+              <w:t>Over-reliance (misuse) and rejection (disuse) both follow from a poor match between trust and reliability (Parasuraman and Riley 1997).</w:t>
+            </w:r>
+          </w:p>
+        </w:tc>
+        <w:tc>
+          <w:tcPr>
+            <w:tcW w:type="dxa" w:w="3200"/>
+          </w:tcPr>
+          <w:p>
+            <w:pPr>
+              <w:spacing w:before="0" w:after="0"/>
+            </w:pPr>
+            <w:r>
+              <w:rPr>
+                <w:sz w:val="20"/>
+              </w:rPr>
+              <w:t>A measure that raises use without raising reliability raises risk.</w:t>
+            </w:r>
+          </w:p>
+        </w:tc>
+      </w:tr>
+      <w:tr>
+        <w:trPr>
+          <w:cantSplit/>
+        </w:trPr>
+        <w:tc>
+          <w:tcPr>
+            <w:tcW w:type="dxa" w:w="1929"/>
+          </w:tcPr>
+          <w:p>
+            <w:pPr>
+              <w:spacing w:before="0" w:after="0"/>
+            </w:pPr>
+            <w:r>
+              <w:rPr>
+                <w:sz w:val="20"/>
+              </w:rPr>
+              <w:t>Learning over time</w:t>
+            </w:r>
+          </w:p>
+        </w:tc>
+        <w:tc>
+          <w:tcPr>
+            <w:tcW w:type="dxa" w:w="4509"/>
+          </w:tcPr>
+          <w:p>
+            <w:pPr>
+              <w:spacing w:before="0" w:after="0"/>
+            </w:pPr>
+            <w:r>
+              <w:rPr>
+                <w:sz w:val="20"/>
+              </w:rPr>
+              <w:t>The guidelines ask to notify users about changes, to update cautiously and to learn from behaviour (Amershi et al. 2019).</w:t>
+            </w:r>
+          </w:p>
+        </w:tc>
+        <w:tc>
+          <w:tcPr>
+            <w:tcW w:type="dxa" w:w="3200"/>
+          </w:tcPr>
+          <w:p>
+            <w:pPr>
+              <w:spacing w:before="0" w:after="0"/>
+            </w:pPr>
+            <w:r>
+              <w:rPr>
+                <w:sz w:val="20"/>
+              </w:rPr>
+              <w:t>Announce when the system changes what it does, and change it in small steps.</w:t>
+            </w:r>
+          </w:p>
+        </w:tc>
+      </w:tr>
+    </w:tbl>
+    <w:p>
+      <w:pPr>
+        <w:spacing w:before="0" w:after="80"/>
+      </w:pPr>
+    </w:p>
     <w:tbl>
       <w:tblPr>
         <w:tblW w:w="9598" w:type="dxa"/>
@@ -5686,7 +7092,7 @@
             </w:pPr>
             <w:r>
               <w:rPr/>
-              <w:t>Northline Rail, Ilka, Mats, Saskia and Bram are made up for this example. Rating options on the same criteria with a reason follows Gibbons (2018). The four criteria are the ones the plan names for the case study.</w:t>
+              <w:t>Northline Rail, Ilka, Mats, Saskia and Bram are made up for this example. Rating options on the same criteria with a reason follows Gibbons (2018). The four criteria are the ones the plan names for the case study. The findings in the table of real evidence are real research results, rules and cases; the sources are listed below.</w:t>
             </w:r>
           </w:p>
         </w:tc>
@@ -5875,7 +7281,7 @@
           <w:color w:val="556274"/>
           <w:sz w:val="18"/>
         </w:rPr>
-        <w:t>Parasuraman &amp; Riley 1997 · Lee &amp; See 2004 · Gibbons 2018</w:t>
+        <w:t>Parasuraman &amp; Riley 1997 · Lee &amp; See 2004 · Gibbons 2018 · Amershi et al. 2019</w:t>
       </w:r>
     </w:p>
     <w:p>
@@ -6182,6 +7588,266 @@
         <w:t>Figure 8 · The layers of an intelligent UX architecture, from a guiding vision to every touchpoint.</w:t>
       </w:r>
     </w:p>
+    <w:p>
+      <w:pPr>
+        <w:spacing w:before="0" w:after="100"/>
+      </w:pPr>
+      <w:r>
+        <w:rPr>
+          <w:b/>
+        </w:rPr>
+        <w:t>Intelligent UX as a decision architecture: structures</w:t>
+      </w:r>
+    </w:p>
+    <w:tbl>
+      <w:tblPr>
+        <w:tblW w:w="9638" w:type="dxa"/>
+        <w:tblBorders>
+          <w:top w:val="single" w:sz="4" w:space="0" w:color="D5DEE9"/>
+          <w:left w:val="single" w:sz="4" w:space="0" w:color="D5DEE9"/>
+          <w:bottom w:val="single" w:sz="4" w:space="0" w:color="D5DEE9"/>
+          <w:right w:val="single" w:sz="4" w:space="0" w:color="D5DEE9"/>
+          <w:insideH w:val="single" w:sz="4" w:space="0" w:color="D5DEE9"/>
+          <w:insideV w:val="single" w:sz="4" w:space="0" w:color="D5DEE9"/>
+        </w:tblBorders>
+        <w:tblLayout w:type="fixed"/>
+        <w:tblCellMar>
+          <w:top w:w="60" w:type="dxa"/>
+          <w:left w:w="100" w:type="dxa"/>
+          <w:bottom w:w="60" w:type="dxa"/>
+          <w:right w:w="100" w:type="dxa"/>
+        </w:tblCellMar>
+      </w:tblPr>
+      <w:tblGrid>
+        <w:gridCol w:w="1645"/>
+        <w:gridCol w:w="4531"/>
+        <w:gridCol w:w="3462"/>
+      </w:tblGrid>
+      <w:tr>
+        <w:trPr>
+          <w:cantSplit/>
+          <w:tblHeader/>
+        </w:trPr>
+        <w:tc>
+          <w:tcPr>
+            <w:tcW w:type="dxa" w:w="1645"/>
+            <w:shd w:val="clear" w:color="auto" w:fill="E6ECF4"/>
+          </w:tcPr>
+          <w:p>
+            <w:pPr>
+              <w:spacing w:before="0" w:after="0"/>
+            </w:pPr>
+            <w:r>
+              <w:rPr>
+                <w:b/>
+                <w:sz w:val="20"/>
+              </w:rPr>
+              <w:t>Part</w:t>
+            </w:r>
+          </w:p>
+        </w:tc>
+        <w:tc>
+          <w:tcPr>
+            <w:tcW w:type="dxa" w:w="4531"/>
+            <w:shd w:val="clear" w:color="auto" w:fill="E6ECF4"/>
+          </w:tcPr>
+          <w:p>
+            <w:pPr>
+              <w:spacing w:before="0" w:after="0"/>
+            </w:pPr>
+            <w:r>
+              <w:rPr>
+                <w:b/>
+                <w:sz w:val="20"/>
+              </w:rPr>
+              <w:t>Real example</w:t>
+            </w:r>
+          </w:p>
+        </w:tc>
+        <w:tc>
+          <w:tcPr>
+            <w:tcW w:type="dxa" w:w="3462"/>
+            <w:shd w:val="clear" w:color="auto" w:fill="E6ECF4"/>
+          </w:tcPr>
+          <w:p>
+            <w:pPr>
+              <w:spacing w:before="0" w:after="0"/>
+            </w:pPr>
+            <w:r>
+              <w:rPr>
+                <w:b/>
+                <w:sz w:val="20"/>
+              </w:rPr>
+              <w:t>What it means</w:t>
+            </w:r>
+          </w:p>
+        </w:tc>
+      </w:tr>
+      <w:tr>
+        <w:trPr>
+          <w:cantSplit/>
+        </w:trPr>
+        <w:tc>
+          <w:tcPr>
+            <w:tcW w:type="dxa" w:w="1645"/>
+          </w:tcPr>
+          <w:p>
+            <w:pPr>
+              <w:spacing w:before="0" w:after="0"/>
+            </w:pPr>
+            <w:r>
+              <w:rPr>
+                <w:sz w:val="20"/>
+              </w:rPr>
+              <w:t>Four phases</w:t>
+            </w:r>
+          </w:p>
+        </w:tc>
+        <w:tc>
+          <w:tcPr>
+            <w:tcW w:type="dxa" w:w="4531"/>
+          </w:tcPr>
+          <w:p>
+            <w:pPr>
+              <w:spacing w:before="0" w:after="0"/>
+            </w:pPr>
+            <w:r>
+              <w:rPr>
+                <w:sz w:val="20"/>
+              </w:rPr>
+              <w:t>Amershi et al. grouped the guidelines into initially, during interaction, when wrong and over time (Amershi et al. 2019).</w:t>
+            </w:r>
+          </w:p>
+        </w:tc>
+        <w:tc>
+          <w:tcPr>
+            <w:tcW w:type="dxa" w:w="3462"/>
+          </w:tcPr>
+          <w:p>
+            <w:pPr>
+              <w:spacing w:before="0" w:after="0"/>
+            </w:pPr>
+            <w:r>
+              <w:rPr>
+                <w:sz w:val="20"/>
+              </w:rPr>
+              <w:t>Plan the architecture over the whole life of a feature, not for its launch.</w:t>
+            </w:r>
+          </w:p>
+        </w:tc>
+      </w:tr>
+      <w:tr>
+        <w:trPr>
+          <w:cantSplit/>
+        </w:trPr>
+        <w:tc>
+          <w:tcPr>
+            <w:tcW w:type="dxa" w:w="1645"/>
+          </w:tcPr>
+          <w:p>
+            <w:pPr>
+              <w:spacing w:before="0" w:after="0"/>
+            </w:pPr>
+            <w:r>
+              <w:rPr>
+                <w:sz w:val="20"/>
+              </w:rPr>
+              <w:t>Mixed initiative</w:t>
+            </w:r>
+          </w:p>
+        </w:tc>
+        <w:tc>
+          <w:tcPr>
+            <w:tcW w:type="dxa" w:w="4531"/>
+          </w:tcPr>
+          <w:p>
+            <w:pPr>
+              <w:spacing w:before="0" w:after="0"/>
+            </w:pPr>
+            <w:r>
+              <w:rPr>
+                <w:sz w:val="20"/>
+              </w:rPr>
+              <w:t>Horvitz asked that automated services act only when the expected benefit outweighs the cost of error (Horvitz 1999).</w:t>
+            </w:r>
+          </w:p>
+        </w:tc>
+        <w:tc>
+          <w:tcPr>
+            <w:tcW w:type="dxa" w:w="3462"/>
+          </w:tcPr>
+          <w:p>
+            <w:pPr>
+              <w:spacing w:before="0" w:after="0"/>
+            </w:pPr>
+            <w:r>
+              <w:rPr>
+                <w:sz w:val="20"/>
+              </w:rPr>
+              <w:t>Set a rule for when the system may act on its own and when it must ask.</w:t>
+            </w:r>
+          </w:p>
+        </w:tc>
+      </w:tr>
+      <w:tr>
+        <w:trPr>
+          <w:cantSplit/>
+        </w:trPr>
+        <w:tc>
+          <w:tcPr>
+            <w:tcW w:type="dxa" w:w="1645"/>
+          </w:tcPr>
+          <w:p>
+            <w:pPr>
+              <w:spacing w:before="0" w:after="0"/>
+            </w:pPr>
+            <w:r>
+              <w:rPr>
+                <w:sz w:val="20"/>
+              </w:rPr>
+              <w:t>Legal frame</w:t>
+            </w:r>
+          </w:p>
+        </w:tc>
+        <w:tc>
+          <w:tcPr>
+            <w:tcW w:type="dxa" w:w="4531"/>
+          </w:tcPr>
+          <w:p>
+            <w:pPr>
+              <w:spacing w:before="0" w:after="0"/>
+            </w:pPr>
+            <w:r>
+              <w:rPr>
+                <w:sz w:val="20"/>
+              </w:rPr>
+              <w:t>The GDPR (Articles 13 to 15 and 22) and the EU AI Act (Article 50) set duties of information and human oversight.</w:t>
+            </w:r>
+          </w:p>
+        </w:tc>
+        <w:tc>
+          <w:tcPr>
+            <w:tcW w:type="dxa" w:w="3462"/>
+          </w:tcPr>
+          <w:p>
+            <w:pPr>
+              <w:spacing w:before="0" w:after="0"/>
+            </w:pPr>
+            <w:r>
+              <w:rPr>
+                <w:sz w:val="20"/>
+              </w:rPr>
+              <w:t>Build the information and the human route into the architecture from the start.</w:t>
+            </w:r>
+          </w:p>
+        </w:tc>
+      </w:tr>
+    </w:tbl>
+    <w:p>
+      <w:pPr>
+        <w:spacing w:before="0" w:after="80"/>
+      </w:pPr>
+    </w:p>
     <w:tbl>
       <w:tblPr>
         <w:tblW w:w="9598" w:type="dxa"/>
@@ -6231,7 +7897,7 @@
             </w:pPr>
             <w:r>
               <w:rPr/>
-              <w:t>Northline Rail, Ilka, Mats, Saskia and Bram are made up for this example. Designing the human side of AI from the user's need follows Amershi et al. (2019).</w:t>
+              <w:t>Northline Rail, Ilka, Mats, Saskia and Bram are made up for this example. Designing the human side of AI from the user's need follows Amershi et al. (2019). The findings in the table of real evidence are real research results, rules and cases; the sources are listed below.</w:t>
             </w:r>
           </w:p>
         </w:tc>
@@ -6420,7 +8086,7 @@
           <w:color w:val="556274"/>
           <w:sz w:val="18"/>
         </w:rPr>
-        <w:t>Amershi et al. 2019 · Horvitz 1999 · Lee &amp; See 2004</w:t>
+        <w:t>Amershi et al. 2019 · Horvitz 1999 · Lee &amp; See 2004 · GDPR · EU AI Act 2024</w:t>
       </w:r>
     </w:p>
     <w:p>
@@ -6913,6 +8579,266 @@
         <w:spacing w:before="0" w:after="80"/>
       </w:pPr>
     </w:p>
+    <w:p>
+      <w:pPr>
+        <w:spacing w:before="0" w:after="100"/>
+      </w:pPr>
+      <w:r>
+        <w:rPr>
+          <w:b/>
+        </w:rPr>
+        <w:t>Conflicts of intelligent UX, with evidence</w:t>
+      </w:r>
+    </w:p>
+    <w:tbl>
+      <w:tblPr>
+        <w:tblW w:w="9638" w:type="dxa"/>
+        <w:tblBorders>
+          <w:top w:val="single" w:sz="4" w:space="0" w:color="D5DEE9"/>
+          <w:left w:val="single" w:sz="4" w:space="0" w:color="D5DEE9"/>
+          <w:bottom w:val="single" w:sz="4" w:space="0" w:color="D5DEE9"/>
+          <w:right w:val="single" w:sz="4" w:space="0" w:color="D5DEE9"/>
+          <w:insideH w:val="single" w:sz="4" w:space="0" w:color="D5DEE9"/>
+          <w:insideV w:val="single" w:sz="4" w:space="0" w:color="D5DEE9"/>
+        </w:tblBorders>
+        <w:tblLayout w:type="fixed"/>
+        <w:tblCellMar>
+          <w:top w:w="60" w:type="dxa"/>
+          <w:left w:w="100" w:type="dxa"/>
+          <w:bottom w:w="60" w:type="dxa"/>
+          <w:right w:w="100" w:type="dxa"/>
+        </w:tblCellMar>
+      </w:tblPr>
+      <w:tblGrid>
+        <w:gridCol w:w="2431"/>
+        <w:gridCol w:w="4479"/>
+        <w:gridCol w:w="2728"/>
+      </w:tblGrid>
+      <w:tr>
+        <w:trPr>
+          <w:cantSplit/>
+          <w:tblHeader/>
+        </w:trPr>
+        <w:tc>
+          <w:tcPr>
+            <w:tcW w:type="dxa" w:w="2431"/>
+            <w:shd w:val="clear" w:color="auto" w:fill="E6ECF4"/>
+          </w:tcPr>
+          <w:p>
+            <w:pPr>
+              <w:spacing w:before="0" w:after="0"/>
+            </w:pPr>
+            <w:r>
+              <w:rPr>
+                <w:b/>
+                <w:sz w:val="20"/>
+              </w:rPr>
+              <w:t>Conflict</w:t>
+            </w:r>
+          </w:p>
+        </w:tc>
+        <w:tc>
+          <w:tcPr>
+            <w:tcW w:type="dxa" w:w="4479"/>
+            <w:shd w:val="clear" w:color="auto" w:fill="E6ECF4"/>
+          </w:tcPr>
+          <w:p>
+            <w:pPr>
+              <w:spacing w:before="0" w:after="0"/>
+            </w:pPr>
+            <w:r>
+              <w:rPr>
+                <w:b/>
+                <w:sz w:val="20"/>
+              </w:rPr>
+              <w:t>What the evidence says</w:t>
+            </w:r>
+          </w:p>
+        </w:tc>
+        <w:tc>
+          <w:tcPr>
+            <w:tcW w:type="dxa" w:w="2728"/>
+            <w:shd w:val="clear" w:color="auto" w:fill="E6ECF4"/>
+          </w:tcPr>
+          <w:p>
+            <w:pPr>
+              <w:spacing w:before="0" w:after="0"/>
+            </w:pPr>
+            <w:r>
+              <w:rPr>
+                <w:b/>
+                <w:sz w:val="20"/>
+              </w:rPr>
+              <w:t>A way to decide</w:t>
+            </w:r>
+          </w:p>
+        </w:tc>
+      </w:tr>
+      <w:tr>
+        <w:trPr>
+          <w:cantSplit/>
+        </w:trPr>
+        <w:tc>
+          <w:tcPr>
+            <w:tcW w:type="dxa" w:w="2431"/>
+          </w:tcPr>
+          <w:p>
+            <w:pPr>
+              <w:spacing w:before="0" w:after="0"/>
+            </w:pPr>
+            <w:r>
+              <w:rPr>
+                <w:sz w:val="20"/>
+              </w:rPr>
+              <w:t>Personalisation against transparency</w:t>
+            </w:r>
+          </w:p>
+        </w:tc>
+        <w:tc>
+          <w:tcPr>
+            <w:tcW w:type="dxa" w:w="4479"/>
+          </w:tcPr>
+          <w:p>
+            <w:pPr>
+              <w:spacing w:before="0" w:after="0"/>
+            </w:pPr>
+            <w:r>
+              <w:rPr>
+                <w:sz w:val="20"/>
+              </w:rPr>
+              <w:t>Recommendations steer about 80% of the hours on a large platform (Gomez-Uribe and Hunt 2015), and the GDPR gives people a right to information about the logic of automated decisions.</w:t>
+            </w:r>
+          </w:p>
+        </w:tc>
+        <w:tc>
+          <w:tcPr>
+            <w:tcW w:type="dxa" w:w="2728"/>
+          </w:tcPr>
+          <w:p>
+            <w:pPr>
+              <w:spacing w:before="0" w:after="0"/>
+            </w:pPr>
+            <w:r>
+              <w:rPr>
+                <w:sz w:val="20"/>
+              </w:rPr>
+              <w:t>Decide how deep an explanation can go, and test that it can be given in a sentence.</w:t>
+            </w:r>
+          </w:p>
+        </w:tc>
+      </w:tr>
+      <w:tr>
+        <w:trPr>
+          <w:cantSplit/>
+        </w:trPr>
+        <w:tc>
+          <w:tcPr>
+            <w:tcW w:type="dxa" w:w="2431"/>
+          </w:tcPr>
+          <w:p>
+            <w:pPr>
+              <w:spacing w:before="0" w:after="0"/>
+            </w:pPr>
+            <w:r>
+              <w:rPr>
+                <w:sz w:val="20"/>
+              </w:rPr>
+              <w:t>Automation against autonomy</w:t>
+            </w:r>
+          </w:p>
+        </w:tc>
+        <w:tc>
+          <w:tcPr>
+            <w:tcW w:type="dxa" w:w="4479"/>
+          </w:tcPr>
+          <w:p>
+            <w:pPr>
+              <w:spacing w:before="0" w:after="0"/>
+            </w:pPr>
+            <w:r>
+              <w:rPr>
+                <w:sz w:val="20"/>
+              </w:rPr>
+              <w:t>Decisions based solely on automated processing with significant effects need safeguards (GDPR Article 22).</w:t>
+            </w:r>
+          </w:p>
+        </w:tc>
+        <w:tc>
+          <w:tcPr>
+            <w:tcW w:type="dxa" w:w="2728"/>
+          </w:tcPr>
+          <w:p>
+            <w:pPr>
+              <w:spacing w:before="0" w:after="0"/>
+            </w:pPr>
+            <w:r>
+              <w:rPr>
+                <w:sz w:val="20"/>
+              </w:rPr>
+              <w:t>Ask whether people would choose to let the system act for them.</w:t>
+            </w:r>
+          </w:p>
+        </w:tc>
+      </w:tr>
+      <w:tr>
+        <w:trPr>
+          <w:cantSplit/>
+        </w:trPr>
+        <w:tc>
+          <w:tcPr>
+            <w:tcW w:type="dxa" w:w="2431"/>
+          </w:tcPr>
+          <w:p>
+            <w:pPr>
+              <w:spacing w:before="0" w:after="0"/>
+            </w:pPr>
+            <w:r>
+              <w:rPr>
+                <w:sz w:val="20"/>
+              </w:rPr>
+              <w:t>Innovation against trust</w:t>
+            </w:r>
+          </w:p>
+        </w:tc>
+        <w:tc>
+          <w:tcPr>
+            <w:tcW w:type="dxa" w:w="4479"/>
+          </w:tcPr>
+          <w:p>
+            <w:pPr>
+              <w:spacing w:before="0" w:after="0"/>
+            </w:pPr>
+            <w:r>
+              <w:rPr>
+                <w:sz w:val="20"/>
+              </w:rPr>
+              <w:t>Trust that does not match reliability leads to misuse or disuse (Lee and See 2004; Parasuraman and Riley 1997).</w:t>
+            </w:r>
+          </w:p>
+        </w:tc>
+        <w:tc>
+          <w:tcPr>
+            <w:tcW w:type="dxa" w:w="2728"/>
+          </w:tcPr>
+          <w:p>
+            <w:pPr>
+              <w:spacing w:before="0" w:after="0"/>
+            </w:pPr>
+            <w:r>
+              <w:rPr>
+                <w:sz w:val="20"/>
+              </w:rPr>
+              <w:t>Plan what happens after the first confident mistake.</w:t>
+            </w:r>
+          </w:p>
+        </w:tc>
+      </w:tr>
+    </w:tbl>
+    <w:p>
+      <w:pPr>
+        <w:spacing w:before="0" w:after="80"/>
+      </w:pPr>
+    </w:p>
     <w:tbl>
       <w:tblPr>
         <w:tblW w:w="9598" w:type="dxa"/>
@@ -6962,7 +8888,7 @@
             </w:pPr>
             <w:r>
               <w:rPr/>
-              <w:t>Northline Rail, Ilka, Mats, Saskia and Bram are made up for this example. The duty to inform people when they interact with an AI system follows the EU AI Act (2024); check the current state of its application before a course run.</w:t>
+              <w:t>Northline Rail, Ilka, Mats, Saskia and Bram are made up for this example. The duty to inform people when they interact with an AI system follows the EU AI Act (2024); check the current state of its application before a course run. The findings in the table of real evidence are real research results, rules and cases; the sources are listed below.</w:t>
             </w:r>
           </w:p>
         </w:tc>
@@ -7151,7 +9077,7 @@
           <w:color w:val="556274"/>
           <w:sz w:val="18"/>
         </w:rPr>
-        <w:t>Pariser 2011 · Lee &amp; See 2004 · EU AI Act 2024</w:t>
+        <w:t>Pariser 2011 · Lee &amp; See 2004 · EU AI Act 2024 · Gomez-Uribe &amp; Hunt 2015 · GDPR · Parasuraman &amp; Riley 1997</w:t>
       </w:r>
     </w:p>
     <w:p>
@@ -7644,6 +9570,266 @@
         <w:spacing w:before="0" w:after="80"/>
       </w:pPr>
     </w:p>
+    <w:p>
+      <w:pPr>
+        <w:spacing w:before="0" w:after="100"/>
+      </w:pPr>
+      <w:r>
+        <w:rPr>
+          <w:b/>
+        </w:rPr>
+        <w:t>Owning an intelligent interface: records and rules</w:t>
+      </w:r>
+    </w:p>
+    <w:tbl>
+      <w:tblPr>
+        <w:tblW w:w="9638" w:type="dxa"/>
+        <w:tblBorders>
+          <w:top w:val="single" w:sz="4" w:space="0" w:color="D5DEE9"/>
+          <w:left w:val="single" w:sz="4" w:space="0" w:color="D5DEE9"/>
+          <w:bottom w:val="single" w:sz="4" w:space="0" w:color="D5DEE9"/>
+          <w:right w:val="single" w:sz="4" w:space="0" w:color="D5DEE9"/>
+          <w:insideH w:val="single" w:sz="4" w:space="0" w:color="D5DEE9"/>
+          <w:insideV w:val="single" w:sz="4" w:space="0" w:color="D5DEE9"/>
+        </w:tblBorders>
+        <w:tblLayout w:type="fixed"/>
+        <w:tblCellMar>
+          <w:top w:w="60" w:type="dxa"/>
+          <w:left w:w="100" w:type="dxa"/>
+          <w:bottom w:w="60" w:type="dxa"/>
+          <w:right w:w="100" w:type="dxa"/>
+        </w:tblCellMar>
+      </w:tblPr>
+      <w:tblGrid>
+        <w:gridCol w:w="1266"/>
+        <w:gridCol w:w="4570"/>
+        <w:gridCol w:w="3802"/>
+      </w:tblGrid>
+      <w:tr>
+        <w:trPr>
+          <w:cantSplit/>
+          <w:tblHeader/>
+        </w:trPr>
+        <w:tc>
+          <w:tcPr>
+            <w:tcW w:type="dxa" w:w="1266"/>
+            <w:shd w:val="clear" w:color="auto" w:fill="E6ECF4"/>
+          </w:tcPr>
+          <w:p>
+            <w:pPr>
+              <w:spacing w:before="0" w:after="0"/>
+            </w:pPr>
+            <w:r>
+              <w:rPr>
+                <w:b/>
+                <w:sz w:val="20"/>
+              </w:rPr>
+              <w:t>Part</w:t>
+            </w:r>
+          </w:p>
+        </w:tc>
+        <w:tc>
+          <w:tcPr>
+            <w:tcW w:type="dxa" w:w="4570"/>
+            <w:shd w:val="clear" w:color="auto" w:fill="E6ECF4"/>
+          </w:tcPr>
+          <w:p>
+            <w:pPr>
+              <w:spacing w:before="0" w:after="0"/>
+            </w:pPr>
+            <w:r>
+              <w:rPr>
+                <w:b/>
+                <w:sz w:val="20"/>
+              </w:rPr>
+              <w:t>Real rule or guideline</w:t>
+            </w:r>
+          </w:p>
+        </w:tc>
+        <w:tc>
+          <w:tcPr>
+            <w:tcW w:type="dxa" w:w="3802"/>
+            <w:shd w:val="clear" w:color="auto" w:fill="E6ECF4"/>
+          </w:tcPr>
+          <w:p>
+            <w:pPr>
+              <w:spacing w:before="0" w:after="0"/>
+            </w:pPr>
+            <w:r>
+              <w:rPr>
+                <w:b/>
+                <w:sz w:val="20"/>
+              </w:rPr>
+              <w:t>What it means</w:t>
+            </w:r>
+          </w:p>
+        </w:tc>
+      </w:tr>
+      <w:tr>
+        <w:trPr>
+          <w:cantSplit/>
+        </w:trPr>
+        <w:tc>
+          <w:tcPr>
+            <w:tcW w:type="dxa" w:w="1266"/>
+          </w:tcPr>
+          <w:p>
+            <w:pPr>
+              <w:spacing w:before="0" w:after="0"/>
+            </w:pPr>
+            <w:r>
+              <w:rPr>
+                <w:sz w:val="20"/>
+              </w:rPr>
+              <w:t>The record</w:t>
+            </w:r>
+          </w:p>
+        </w:tc>
+        <w:tc>
+          <w:tcPr>
+            <w:tcW w:type="dxa" w:w="4570"/>
+          </w:tcPr>
+          <w:p>
+            <w:pPr>
+              <w:spacing w:before="0" w:after="0"/>
+            </w:pPr>
+            <w:r>
+              <w:rPr>
+                <w:sz w:val="20"/>
+              </w:rPr>
+              <w:t>The guidelines ask for clarity on what the system can do and how well, on why it acted, and on how it changes (Amershi et al. 2019).</w:t>
+            </w:r>
+          </w:p>
+        </w:tc>
+        <w:tc>
+          <w:tcPr>
+            <w:tcW w:type="dxa" w:w="3802"/>
+          </w:tcPr>
+          <w:p>
+            <w:pPr>
+              <w:spacing w:before="0" w:after="0"/>
+            </w:pPr>
+            <w:r>
+              <w:rPr>
+                <w:sz w:val="20"/>
+              </w:rPr>
+              <w:t>Write down for each intelligent function what it suggests, from which data, how it explains itself and how it is switched off.</w:t>
+            </w:r>
+          </w:p>
+        </w:tc>
+      </w:tr>
+      <w:tr>
+        <w:trPr>
+          <w:cantSplit/>
+        </w:trPr>
+        <w:tc>
+          <w:tcPr>
+            <w:tcW w:type="dxa" w:w="1266"/>
+          </w:tcPr>
+          <w:p>
+            <w:pPr>
+              <w:spacing w:before="0" w:after="0"/>
+            </w:pPr>
+            <w:r>
+              <w:rPr>
+                <w:sz w:val="20"/>
+              </w:rPr>
+              <w:t>Who checks</w:t>
+            </w:r>
+          </w:p>
+        </w:tc>
+        <w:tc>
+          <w:tcPr>
+            <w:tcW w:type="dxa" w:w="4570"/>
+          </w:tcPr>
+          <w:p>
+            <w:pPr>
+              <w:spacing w:before="0" w:after="0"/>
+            </w:pPr>
+            <w:r>
+              <w:rPr>
+                <w:sz w:val="20"/>
+              </w:rPr>
+              <w:t>The GDPR sets conditions for automated decisions and for the data behind them (GDPR Article 22).</w:t>
+            </w:r>
+          </w:p>
+        </w:tc>
+        <w:tc>
+          <w:tcPr>
+            <w:tcW w:type="dxa" w:w="3802"/>
+          </w:tcPr>
+          <w:p>
+            <w:pPr>
+              <w:spacing w:before="0" w:after="0"/>
+            </w:pPr>
+            <w:r>
+              <w:rPr>
+                <w:sz w:val="20"/>
+              </w:rPr>
+              <w:t>Give data protection a right to veto, and let service check the wording.</w:t>
+            </w:r>
+          </w:p>
+        </w:tc>
+      </w:tr>
+      <w:tr>
+        <w:trPr>
+          <w:cantSplit/>
+        </w:trPr>
+        <w:tc>
+          <w:tcPr>
+            <w:tcW w:type="dxa" w:w="1266"/>
+          </w:tcPr>
+          <w:p>
+            <w:pPr>
+              <w:spacing w:before="0" w:after="0"/>
+            </w:pPr>
+            <w:r>
+              <w:rPr>
+                <w:sz w:val="20"/>
+              </w:rPr>
+              <w:t>The duty to inform</w:t>
+            </w:r>
+          </w:p>
+        </w:tc>
+        <w:tc>
+          <w:tcPr>
+            <w:tcW w:type="dxa" w:w="4570"/>
+          </w:tcPr>
+          <w:p>
+            <w:pPr>
+              <w:spacing w:before="0" w:after="0"/>
+            </w:pPr>
+            <w:r>
+              <w:rPr>
+                <w:sz w:val="20"/>
+              </w:rPr>
+              <w:t>The EU AI Act (Article 50) requires that people are informed when they interact with an AI system.</w:t>
+            </w:r>
+          </w:p>
+        </w:tc>
+        <w:tc>
+          <w:tcPr>
+            <w:tcW w:type="dxa" w:w="3802"/>
+          </w:tcPr>
+          <w:p>
+            <w:pPr>
+              <w:spacing w:before="0" w:after="0"/>
+            </w:pPr>
+            <w:r>
+              <w:rPr>
+                <w:sz w:val="20"/>
+              </w:rPr>
+              <w:t>Add the notice to the release checklist.</w:t>
+            </w:r>
+          </w:p>
+        </w:tc>
+      </w:tr>
+    </w:tbl>
+    <w:p>
+      <w:pPr>
+        <w:spacing w:before="0" w:after="80"/>
+      </w:pPr>
+    </w:p>
     <w:tbl>
       <w:tblPr>
         <w:tblW w:w="9598" w:type="dxa"/>
@@ -7693,7 +9879,7 @@
             </w:pPr>
             <w:r>
               <w:rPr/>
-              <w:t>Northline Rail, Ilka, Mats, Saskia and Bram are made up for this example. Deciding with limited information follows Simon (1956); the premortem follows Klein (2007).</w:t>
+              <w:t>Northline Rail, Ilka, Mats, Saskia and Bram are made up for this example. Deciding with limited information follows Simon (1956); the premortem follows Klein (2007). The findings in the table of real evidence are real research results, rules and cases; the sources are listed below.</w:t>
             </w:r>
           </w:p>
         </w:tc>
@@ -7882,7 +10068,7 @@
           <w:color w:val="556274"/>
           <w:sz w:val="18"/>
         </w:rPr>
-        <w:t>Simon 1956 · Klein 2007 · EU AI Act 2024</w:t>
+        <w:t>Simon 1956 · Klein 2007 · EU AI Act 2024 · Amershi et al. 2019 · GDPR</w:t>
       </w:r>
     </w:p>
     <w:p>
@@ -8567,6 +10753,18 @@
         <w:rPr>
           <w:sz w:val="19"/>
         </w:rPr>
+        <w:t>Gomez-Uribe, C. A., &amp; Hunt, N. (2015). The Netflix recommender system: Algorithms, business value, and innovation. ACM Transactions on Management Information Systems, 6(4), Article 13. (The recommender influences the choice for about 80% of the hours streamed; the value estimate is the company's own.)</w:t>
+      </w:r>
+    </w:p>
+    <w:p>
+      <w:pPr>
+        <w:spacing w:before="0" w:after="80"/>
+        <w:ind w:left="283" w:hanging="283"/>
+      </w:pPr>
+      <w:r>
+        <w:rPr>
+          <w:sz w:val="19"/>
+        </w:rPr>
         <w:t>Pariser, E. (2011). The Filter Bubble: What the Internet Is Hiding from You. Penguin Press. (Personalisation that narrows what people see to what they saw before.)</w:t>
       </w:r>
     </w:p>
@@ -8603,7 +10801,19 @@
         <w:rPr>
           <w:sz w:val="19"/>
         </w:rPr>
-        <w:t>Gibbons, S. (2018). Using Prioritization Matrices to Inform UX Decisions. Nielsen Norman Group. https://www.nngroup.com/articles/prioritization-matrices/ (Rate each option on the same few criteria, such as value to the user against effort, and put the reason next to each rating.)</w:t>
+        <w:t>Bakshy, E., Messing, S., &amp; Adamic, L. A. (2015). Exposure to ideologically diverse news and opinion on Facebook. Science, 348(6239), 1130–1132. (Among 10.1 million US users, the ranking algorithm and the users' own clicks each reduced exposure to cross-cutting content; figures from summaries, check the paper.)</w:t>
+      </w:r>
+    </w:p>
+    <w:p>
+      <w:pPr>
+        <w:spacing w:before="0" w:after="80"/>
+        <w:ind w:left="283" w:hanging="283"/>
+      </w:pPr>
+      <w:r>
+        <w:rPr>
+          <w:sz w:val="19"/>
+        </w:rPr>
+        <w:t>Regulation (EU) 2016/679 (General Data Protection Regulation), Articles 13 to 15 and 22. https://eur-lex.europa.eu/eli/reg/2016/679/oj (Information about automated decision-making and its logic; the right not to be subject to a decision based solely on automated processing with legal or similarly significant effects, with safeguards. Check the text.)</w:t>
       </w:r>
     </w:p>
     <w:p>
@@ -8616,6 +10826,18 @@
           <w:sz w:val="19"/>
         </w:rPr>
         <w:t>Regulation (EU) 2024/1689 of the European Parliament and of the Council laying down harmonised rules on artificial intelligence (Artificial Intelligence Act). Official Journal of the European Union, 12 July 2024. (Among other duties, people must be informed when they interact with an AI system; check the current state of its application before a course run.)</w:t>
+      </w:r>
+    </w:p>
+    <w:p>
+      <w:pPr>
+        <w:spacing w:before="0" w:after="80"/>
+        <w:ind w:left="283" w:hanging="283"/>
+      </w:pPr>
+      <w:r>
+        <w:rPr>
+          <w:sz w:val="19"/>
+        </w:rPr>
+        <w:t>Gibbons, S. (2018). Using Prioritization Matrices to Inform UX Decisions. Nielsen Norman Group. https://www.nngroup.com/articles/prioritization-matrices/ (Rate each option on the same few criteria, such as value to the user against effort, and put the reason next to each rating.)</w:t>
       </w:r>
     </w:p>
     <w:p>
@@ -8688,9 +10910,9 @@
         </w:tblCellMar>
       </w:tblPr>
       <w:tblGrid>
-        <w:gridCol w:w="2737"/>
-        <w:gridCol w:w="4882"/>
-        <w:gridCol w:w="1112"/>
+        <w:gridCol w:w="2735"/>
+        <w:gridCol w:w="4895"/>
+        <w:gridCol w:w="1101"/>
         <w:gridCol w:w="907"/>
       </w:tblGrid>
       <w:tr>
@@ -8700,7 +10922,7 @@
         </w:trPr>
         <w:tc>
           <w:tcPr>
-            <w:tcW w:type="dxa" w:w="2737"/>
+            <w:tcW w:type="dxa" w:w="2735"/>
             <w:shd w:val="clear" w:color="auto" w:fill="E6ECF4"/>
           </w:tcPr>
           <w:p>
@@ -8718,7 +10940,7 @@
         </w:tc>
         <w:tc>
           <w:tcPr>
-            <w:tcW w:type="dxa" w:w="4882"/>
+            <w:tcW w:type="dxa" w:w="4895"/>
             <w:shd w:val="clear" w:color="auto" w:fill="E6ECF4"/>
           </w:tcPr>
           <w:p>
@@ -8736,7 +10958,7 @@
         </w:tc>
         <w:tc>
           <w:tcPr>
-            <w:tcW w:type="dxa" w:w="1112"/>
+            <w:tcW w:type="dxa" w:w="1101"/>
             <w:shd w:val="clear" w:color="auto" w:fill="E6ECF4"/>
           </w:tcPr>
           <w:p>
@@ -8777,7 +10999,7 @@
         </w:trPr>
         <w:tc>
           <w:tcPr>
-            <w:tcW w:type="dxa" w:w="2737"/>
+            <w:tcW w:type="dxa" w:w="2735"/>
           </w:tcPr>
           <w:p>
             <w:pPr>
@@ -8794,7 +11016,7 @@
         </w:tc>
         <w:tc>
           <w:tcPr>
-            <w:tcW w:type="dxa" w:w="4882"/>
+            <w:tcW w:type="dxa" w:w="4895"/>
           </w:tcPr>
           <w:p>
             <w:pPr>
@@ -8810,7 +11032,7 @@
         </w:tc>
         <w:tc>
           <w:tcPr>
-            <w:tcW w:type="dxa" w:w="1112"/>
+            <w:tcW w:type="dxa" w:w="1101"/>
           </w:tcPr>
           <w:p>
             <w:pPr>
@@ -8847,7 +11069,7 @@
         </w:trPr>
         <w:tc>
           <w:tcPr>
-            <w:tcW w:type="dxa" w:w="2737"/>
+            <w:tcW w:type="dxa" w:w="2735"/>
           </w:tcPr>
           <w:p>
             <w:pPr>
@@ -8864,7 +11086,7 @@
         </w:tc>
         <w:tc>
           <w:tcPr>
-            <w:tcW w:type="dxa" w:w="4882"/>
+            <w:tcW w:type="dxa" w:w="4895"/>
           </w:tcPr>
           <w:p>
             <w:pPr>
@@ -8880,7 +11102,7 @@
         </w:tc>
         <w:tc>
           <w:tcPr>
-            <w:tcW w:type="dxa" w:w="1112"/>
+            <w:tcW w:type="dxa" w:w="1101"/>
           </w:tcPr>
           <w:p>
             <w:pPr>
@@ -8917,7 +11139,7 @@
         </w:trPr>
         <w:tc>
           <w:tcPr>
-            <w:tcW w:type="dxa" w:w="2737"/>
+            <w:tcW w:type="dxa" w:w="2735"/>
           </w:tcPr>
           <w:p>
             <w:pPr>
@@ -8934,7 +11156,7 @@
         </w:tc>
         <w:tc>
           <w:tcPr>
-            <w:tcW w:type="dxa" w:w="4882"/>
+            <w:tcW w:type="dxa" w:w="4895"/>
           </w:tcPr>
           <w:p>
             <w:pPr>
@@ -8950,7 +11172,7 @@
         </w:tc>
         <w:tc>
           <w:tcPr>
-            <w:tcW w:type="dxa" w:w="1112"/>
+            <w:tcW w:type="dxa" w:w="1101"/>
           </w:tcPr>
           <w:p>
             <w:pPr>
@@ -8987,7 +11209,7 @@
         </w:trPr>
         <w:tc>
           <w:tcPr>
-            <w:tcW w:type="dxa" w:w="2737"/>
+            <w:tcW w:type="dxa" w:w="2735"/>
           </w:tcPr>
           <w:p>
             <w:pPr>
@@ -9004,7 +11226,7 @@
         </w:tc>
         <w:tc>
           <w:tcPr>
-            <w:tcW w:type="dxa" w:w="4882"/>
+            <w:tcW w:type="dxa" w:w="4895"/>
           </w:tcPr>
           <w:p>
             <w:pPr>
@@ -9020,7 +11242,7 @@
         </w:tc>
         <w:tc>
           <w:tcPr>
-            <w:tcW w:type="dxa" w:w="1112"/>
+            <w:tcW w:type="dxa" w:w="1101"/>
           </w:tcPr>
           <w:p>
             <w:pPr>
@@ -9057,7 +11279,7 @@
         </w:trPr>
         <w:tc>
           <w:tcPr>
-            <w:tcW w:type="dxa" w:w="2737"/>
+            <w:tcW w:type="dxa" w:w="2735"/>
           </w:tcPr>
           <w:p>
             <w:pPr>
@@ -9074,7 +11296,7 @@
         </w:tc>
         <w:tc>
           <w:tcPr>
-            <w:tcW w:type="dxa" w:w="4882"/>
+            <w:tcW w:type="dxa" w:w="4895"/>
           </w:tcPr>
           <w:p>
             <w:pPr>
@@ -9090,7 +11312,7 @@
         </w:tc>
         <w:tc>
           <w:tcPr>
-            <w:tcW w:type="dxa" w:w="1112"/>
+            <w:tcW w:type="dxa" w:w="1101"/>
           </w:tcPr>
           <w:p>
             <w:pPr>
@@ -9127,7 +11349,7 @@
         </w:trPr>
         <w:tc>
           <w:tcPr>
-            <w:tcW w:type="dxa" w:w="2737"/>
+            <w:tcW w:type="dxa" w:w="2735"/>
           </w:tcPr>
           <w:p>
             <w:pPr>
@@ -9144,7 +11366,7 @@
         </w:tc>
         <w:tc>
           <w:tcPr>
-            <w:tcW w:type="dxa" w:w="4882"/>
+            <w:tcW w:type="dxa" w:w="4895"/>
           </w:tcPr>
           <w:p>
             <w:pPr>
@@ -9160,7 +11382,7 @@
         </w:tc>
         <w:tc>
           <w:tcPr>
-            <w:tcW w:type="dxa" w:w="1112"/>
+            <w:tcW w:type="dxa" w:w="1101"/>
           </w:tcPr>
           <w:p>
             <w:pPr>
@@ -9197,7 +11419,7 @@
         </w:trPr>
         <w:tc>
           <w:tcPr>
-            <w:tcW w:type="dxa" w:w="2737"/>
+            <w:tcW w:type="dxa" w:w="2735"/>
           </w:tcPr>
           <w:p>
             <w:pPr>
@@ -9208,13 +11430,13 @@
                 <w:b/>
                 <w:sz w:val="19"/>
               </w:rPr>
-              <w:t>Intelligent interface</w:t>
-            </w:r>
-          </w:p>
-        </w:tc>
-        <w:tc>
-          <w:tcPr>
-            <w:tcW w:type="dxa" w:w="4882"/>
+              <w:t>Grouping</w:t>
+            </w:r>
+          </w:p>
+        </w:tc>
+        <w:tc>
+          <w:tcPr>
+            <w:tcW w:type="dxa" w:w="4895"/>
           </w:tcPr>
           <w:p>
             <w:pPr>
@@ -9224,13 +11446,13 @@
               <w:rPr>
                 <w:sz w:val="19"/>
               </w:rPr>
-              <w:t>An interface that supports people in a way that fits their situation: it suggests, adapts or helps, instead of only doing the same thing for everyone.</w:t>
-            </w:r>
-          </w:p>
-        </w:tc>
-        <w:tc>
-          <w:tcPr>
-            <w:tcW w:type="dxa" w:w="1112"/>
+              <w:t>Showing what belongs together, for example by putting it close together or making it look alike. The eye reads a group as one unit.</w:t>
+            </w:r>
+          </w:p>
+        </w:tc>
+        <w:tc>
+          <w:tcPr>
+            <w:tcW w:type="dxa" w:w="1101"/>
           </w:tcPr>
           <w:p>
             <w:pPr>
@@ -9256,7 +11478,7 @@
               <w:rPr>
                 <w:sz w:val="19"/>
               </w:rPr>
-              <w:t>Day 10</w:t>
+              <w:t>Day 2</w:t>
             </w:r>
           </w:p>
         </w:tc>
@@ -9267,7 +11489,7 @@
         </w:trPr>
         <w:tc>
           <w:tcPr>
-            <w:tcW w:type="dxa" w:w="2737"/>
+            <w:tcW w:type="dxa" w:w="2735"/>
           </w:tcPr>
           <w:p>
             <w:pPr>
@@ -9278,13 +11500,13 @@
                 <w:b/>
                 <w:sz w:val="19"/>
               </w:rPr>
-              <w:t>Learning system</w:t>
-            </w:r>
-          </w:p>
-        </w:tc>
-        <w:tc>
-          <w:tcPr>
-            <w:tcW w:type="dxa" w:w="4882"/>
+              <w:t>Intelligent interface</w:t>
+            </w:r>
+          </w:p>
+        </w:tc>
+        <w:tc>
+          <w:tcPr>
+            <w:tcW w:type="dxa" w:w="4895"/>
           </w:tcPr>
           <w:p>
             <w:pPr>
@@ -9294,13 +11516,13 @@
               <w:rPr>
                 <w:sz w:val="19"/>
               </w:rPr>
-              <w:t>A system that changes with data over time; it gets to know a person, so the same input can give a different output next month.</w:t>
-            </w:r>
-          </w:p>
-        </w:tc>
-        <w:tc>
-          <w:tcPr>
-            <w:tcW w:type="dxa" w:w="1112"/>
+              <w:t>An interface that supports people in a way that fits their situation: it suggests, adapts or helps, instead of only doing the same thing for everyone.</w:t>
+            </w:r>
+          </w:p>
+        </w:tc>
+        <w:tc>
+          <w:tcPr>
+            <w:tcW w:type="dxa" w:w="1101"/>
           </w:tcPr>
           <w:p>
             <w:pPr>
@@ -9337,7 +11559,7 @@
         </w:trPr>
         <w:tc>
           <w:tcPr>
-            <w:tcW w:type="dxa" w:w="2737"/>
+            <w:tcW w:type="dxa" w:w="2735"/>
           </w:tcPr>
           <w:p>
             <w:pPr>
@@ -9348,13 +11570,13 @@
                 <w:b/>
                 <w:sz w:val="19"/>
               </w:rPr>
-              <w:t>Misadaptation</w:t>
-            </w:r>
-          </w:p>
-        </w:tc>
-        <w:tc>
-          <w:tcPr>
-            <w:tcW w:type="dxa" w:w="4882"/>
+              <w:t>Learning system</w:t>
+            </w:r>
+          </w:p>
+        </w:tc>
+        <w:tc>
+          <w:tcPr>
+            <w:tcW w:type="dxa" w:w="4895"/>
           </w:tcPr>
           <w:p>
             <w:pPr>
@@ -9364,13 +11586,13 @@
               <w:rPr>
                 <w:sz w:val="19"/>
               </w:rPr>
-              <w:t>When a system adapts to the wrong situation or the wrong picture of a person, so its help does not fit.</w:t>
-            </w:r>
-          </w:p>
-        </w:tc>
-        <w:tc>
-          <w:tcPr>
-            <w:tcW w:type="dxa" w:w="1112"/>
+              <w:t>A system that changes with data over time; it gets to know a person, so the same input can give a different output next month.</w:t>
+            </w:r>
+          </w:p>
+        </w:tc>
+        <w:tc>
+          <w:tcPr>
+            <w:tcW w:type="dxa" w:w="1101"/>
           </w:tcPr>
           <w:p>
             <w:pPr>
@@ -9407,7 +11629,7 @@
         </w:trPr>
         <w:tc>
           <w:tcPr>
-            <w:tcW w:type="dxa" w:w="2737"/>
+            <w:tcW w:type="dxa" w:w="2735"/>
           </w:tcPr>
           <w:p>
             <w:pPr>
@@ -9418,13 +11640,13 @@
                 <w:b/>
                 <w:sz w:val="19"/>
               </w:rPr>
-              <w:t>Neuro-UX</w:t>
-            </w:r>
-          </w:p>
-        </w:tc>
-        <w:tc>
-          <w:tcPr>
-            <w:tcW w:type="dxa" w:w="4882"/>
+              <w:t>Misadaptation</w:t>
+            </w:r>
+          </w:p>
+        </w:tc>
+        <w:tc>
+          <w:tcPr>
+            <w:tcW w:type="dxa" w:w="4895"/>
           </w:tcPr>
           <w:p>
             <w:pPr>
@@ -9434,13 +11656,13 @@
               <w:rPr>
                 <w:sz w:val="19"/>
               </w:rPr>
-              <w:t>Designing an interface with knowledge of how the brain sees, attends, feels and decides, so that the design steers these processes on purpose and responsibly.</w:t>
-            </w:r>
-          </w:p>
-        </w:tc>
-        <w:tc>
-          <w:tcPr>
-            <w:tcW w:type="dxa" w:w="1112"/>
+              <w:t>When a system adapts to the wrong situation or the wrong picture of a person, so its help does not fit.</w:t>
+            </w:r>
+          </w:p>
+        </w:tc>
+        <w:tc>
+          <w:tcPr>
+            <w:tcW w:type="dxa" w:w="1101"/>
           </w:tcPr>
           <w:p>
             <w:pPr>
@@ -9466,7 +11688,7 @@
               <w:rPr>
                 <w:sz w:val="19"/>
               </w:rPr>
-              <w:t>Day 1</w:t>
+              <w:t>Day 10</w:t>
             </w:r>
           </w:p>
         </w:tc>
@@ -9477,7 +11699,7 @@
         </w:trPr>
         <w:tc>
           <w:tcPr>
-            <w:tcW w:type="dxa" w:w="2737"/>
+            <w:tcW w:type="dxa" w:w="2735"/>
           </w:tcPr>
           <w:p>
             <w:pPr>
@@ -9488,13 +11710,13 @@
                 <w:b/>
                 <w:sz w:val="19"/>
               </w:rPr>
-              <w:t>Over-personalisation</w:t>
-            </w:r>
-          </w:p>
-        </w:tc>
-        <w:tc>
-          <w:tcPr>
-            <w:tcW w:type="dxa" w:w="4882"/>
+              <w:t>Neuro-UX</w:t>
+            </w:r>
+          </w:p>
+        </w:tc>
+        <w:tc>
+          <w:tcPr>
+            <w:tcW w:type="dxa" w:w="4895"/>
           </w:tcPr>
           <w:p>
             <w:pPr>
@@ -9504,13 +11726,13 @@
               <w:rPr>
                 <w:sz w:val="19"/>
               </w:rPr>
-              <w:t>Personalising so much that it feels like being watched, or so narrowly that people only ever see more of the same.</w:t>
-            </w:r>
-          </w:p>
-        </w:tc>
-        <w:tc>
-          <w:tcPr>
-            <w:tcW w:type="dxa" w:w="1112"/>
+              <w:t>Designing an interface with knowledge of how the brain sees, attends, feels and decides, so that the design steers these processes on purpose and responsibly.</w:t>
+            </w:r>
+          </w:p>
+        </w:tc>
+        <w:tc>
+          <w:tcPr>
+            <w:tcW w:type="dxa" w:w="1101"/>
           </w:tcPr>
           <w:p>
             <w:pPr>
@@ -9536,7 +11758,7 @@
               <w:rPr>
                 <w:sz w:val="19"/>
               </w:rPr>
-              <w:t>Day 10</w:t>
+              <w:t>Day 1</w:t>
             </w:r>
           </w:p>
         </w:tc>
@@ -9547,7 +11769,7 @@
         </w:trPr>
         <w:tc>
           <w:tcPr>
-            <w:tcW w:type="dxa" w:w="2737"/>
+            <w:tcW w:type="dxa" w:w="2735"/>
           </w:tcPr>
           <w:p>
             <w:pPr>
@@ -9558,13 +11780,13 @@
                 <w:b/>
                 <w:sz w:val="19"/>
               </w:rPr>
-              <w:t>Perceived control</w:t>
-            </w:r>
-          </w:p>
-        </w:tc>
-        <w:tc>
-          <w:tcPr>
-            <w:tcW w:type="dxa" w:w="4882"/>
+              <w:t>Over-personalisation</w:t>
+            </w:r>
+          </w:p>
+        </w:tc>
+        <w:tc>
+          <w:tcPr>
+            <w:tcW w:type="dxa" w:w="4895"/>
           </w:tcPr>
           <w:p>
             <w:pPr>
@@ -9574,13 +11796,13 @@
               <w:rPr>
                 <w:sz w:val="19"/>
               </w:rPr>
-              <w:t>How much people feel they can steer a system; it decides how they feel about automation, even when it differs from the control they really have.</w:t>
-            </w:r>
-          </w:p>
-        </w:tc>
-        <w:tc>
-          <w:tcPr>
-            <w:tcW w:type="dxa" w:w="1112"/>
+              <w:t>Personalising so much that it feels like being watched, or so narrowly that people only ever see more of the same.</w:t>
+            </w:r>
+          </w:p>
+        </w:tc>
+        <w:tc>
+          <w:tcPr>
+            <w:tcW w:type="dxa" w:w="1101"/>
           </w:tcPr>
           <w:p>
             <w:pPr>
@@ -9617,7 +11839,7 @@
         </w:trPr>
         <w:tc>
           <w:tcPr>
-            <w:tcW w:type="dxa" w:w="2737"/>
+            <w:tcW w:type="dxa" w:w="2735"/>
           </w:tcPr>
           <w:p>
             <w:pPr>
@@ -9628,13 +11850,13 @@
                 <w:b/>
                 <w:sz w:val="19"/>
               </w:rPr>
-              <w:t>Personalisation</w:t>
-            </w:r>
-          </w:p>
-        </w:tc>
-        <w:tc>
-          <w:tcPr>
-            <w:tcW w:type="dxa" w:w="4882"/>
+              <w:t>Perceived control</w:t>
+            </w:r>
+          </w:p>
+        </w:tc>
+        <w:tc>
+          <w:tcPr>
+            <w:tcW w:type="dxa" w:w="4895"/>
           </w:tcPr>
           <w:p>
             <w:pPr>
@@ -9644,13 +11866,13 @@
               <w:rPr>
                 <w:sz w:val="19"/>
               </w:rPr>
-              <w:t>Changing what someone sees from what is known about them: their history, their preferences, their profile.</w:t>
-            </w:r>
-          </w:p>
-        </w:tc>
-        <w:tc>
-          <w:tcPr>
-            <w:tcW w:type="dxa" w:w="1112"/>
+              <w:t>How much people feel they can steer a system; it decides how they feel about automation, even when it differs from the control they really have.</w:t>
+            </w:r>
+          </w:p>
+        </w:tc>
+        <w:tc>
+          <w:tcPr>
+            <w:tcW w:type="dxa" w:w="1101"/>
           </w:tcPr>
           <w:p>
             <w:pPr>
@@ -9687,7 +11909,7 @@
         </w:trPr>
         <w:tc>
           <w:tcPr>
-            <w:tcW w:type="dxa" w:w="2737"/>
+            <w:tcW w:type="dxa" w:w="2735"/>
           </w:tcPr>
           <w:p>
             <w:pPr>
@@ -9698,13 +11920,13 @@
                 <w:b/>
                 <w:sz w:val="19"/>
               </w:rPr>
-              <w:t>Recoverability</w:t>
-            </w:r>
-          </w:p>
-        </w:tc>
-        <w:tc>
-          <w:tcPr>
-            <w:tcW w:type="dxa" w:w="4882"/>
+              <w:t>Personalisation</w:t>
+            </w:r>
+          </w:p>
+        </w:tc>
+        <w:tc>
+          <w:tcPr>
+            <w:tcW w:type="dxa" w:w="4895"/>
           </w:tcPr>
           <w:p>
             <w:pPr>
@@ -9714,13 +11936,13 @@
               <w:rPr>
                 <w:sz w:val="19"/>
               </w:rPr>
-              <w:t>If the system gets it wrong, the person can undo it or set it right without help.</w:t>
-            </w:r>
-          </w:p>
-        </w:tc>
-        <w:tc>
-          <w:tcPr>
-            <w:tcW w:type="dxa" w:w="1112"/>
+              <w:t>Changing what someone sees from what is known about them: their history, their preferences, their profile.</w:t>
+            </w:r>
+          </w:p>
+        </w:tc>
+        <w:tc>
+          <w:tcPr>
+            <w:tcW w:type="dxa" w:w="1101"/>
           </w:tcPr>
           <w:p>
             <w:pPr>
@@ -9757,7 +11979,7 @@
         </w:trPr>
         <w:tc>
           <w:tcPr>
-            <w:tcW w:type="dxa" w:w="2737"/>
+            <w:tcW w:type="dxa" w:w="2735"/>
           </w:tcPr>
           <w:p>
             <w:pPr>
@@ -9768,13 +11990,13 @@
                 <w:b/>
                 <w:sz w:val="19"/>
               </w:rPr>
-              <w:t>Rule-based system</w:t>
-            </w:r>
-          </w:p>
-        </w:tc>
-        <w:tc>
-          <w:tcPr>
-            <w:tcW w:type="dxa" w:w="4882"/>
+              <w:t>Ranking (leaderboard)</w:t>
+            </w:r>
+          </w:p>
+        </w:tc>
+        <w:tc>
+          <w:tcPr>
+            <w:tcW w:type="dxa" w:w="4895"/>
           </w:tcPr>
           <w:p>
             <w:pPr>
@@ -9784,13 +12006,13 @@
               <w:rPr>
                 <w:sz w:val="19"/>
               </w:rPr>
-              <w:t>A system that follows fixed rules written by people: the same input always gives the same output, and the rule can be said in one sentence.</w:t>
-            </w:r>
-          </w:p>
-        </w:tc>
-        <w:tc>
-          <w:tcPr>
-            <w:tcW w:type="dxa" w:w="1112"/>
+              <w:t>A list that orders people by points or results; it motivates those near the top and can shame those near the bottom.</w:t>
+            </w:r>
+          </w:p>
+        </w:tc>
+        <w:tc>
+          <w:tcPr>
+            <w:tcW w:type="dxa" w:w="1101"/>
           </w:tcPr>
           <w:p>
             <w:pPr>
@@ -9816,7 +12038,7 @@
               <w:rPr>
                 <w:sz w:val="19"/>
               </w:rPr>
-              <w:t>Day 10</w:t>
+              <w:t>Day 9</w:t>
             </w:r>
           </w:p>
         </w:tc>
@@ -9827,7 +12049,7 @@
         </w:trPr>
         <w:tc>
           <w:tcPr>
-            <w:tcW w:type="dxa" w:w="2737"/>
+            <w:tcW w:type="dxa" w:w="2735"/>
           </w:tcPr>
           <w:p>
             <w:pPr>
@@ -9838,13 +12060,13 @@
                 <w:b/>
                 <w:sz w:val="19"/>
               </w:rPr>
-              <w:t>Touchpoint</w:t>
-            </w:r>
-          </w:p>
-        </w:tc>
-        <w:tc>
-          <w:tcPr>
-            <w:tcW w:type="dxa" w:w="4882"/>
+              <w:t>Recoverability</w:t>
+            </w:r>
+          </w:p>
+        </w:tc>
+        <w:tc>
+          <w:tcPr>
+            <w:tcW w:type="dxa" w:w="4895"/>
           </w:tcPr>
           <w:p>
             <w:pPr>
@@ -9854,13 +12076,13 @@
               <w:rPr>
                 <w:sz w:val="19"/>
               </w:rPr>
-              <w:t>Any place where a person meets the company: the website, the customer portal, the app, a chatbot or a phone call.</w:t>
-            </w:r>
-          </w:p>
-        </w:tc>
-        <w:tc>
-          <w:tcPr>
-            <w:tcW w:type="dxa" w:w="1112"/>
+              <w:t>If the system gets it wrong, the person can undo it or set it right without help.</w:t>
+            </w:r>
+          </w:p>
+        </w:tc>
+        <w:tc>
+          <w:tcPr>
+            <w:tcW w:type="dxa" w:w="1101"/>
           </w:tcPr>
           <w:p>
             <w:pPr>
@@ -9886,7 +12108,7 @@
               <w:rPr>
                 <w:sz w:val="19"/>
               </w:rPr>
-              <w:t>Day 1</w:t>
+              <w:t>Day 10</w:t>
             </w:r>
           </w:p>
         </w:tc>
@@ -9897,7 +12119,7 @@
         </w:trPr>
         <w:tc>
           <w:tcPr>
-            <w:tcW w:type="dxa" w:w="2737"/>
+            <w:tcW w:type="dxa" w:w="2735"/>
           </w:tcPr>
           <w:p>
             <w:pPr>
@@ -9908,13 +12130,13 @@
                 <w:b/>
                 <w:sz w:val="19"/>
               </w:rPr>
-              <w:t>UX (user experience)</w:t>
-            </w:r>
-          </w:p>
-        </w:tc>
-        <w:tc>
-          <w:tcPr>
-            <w:tcW w:type="dxa" w:w="4882"/>
+              <w:t>Rule-based system</w:t>
+            </w:r>
+          </w:p>
+        </w:tc>
+        <w:tc>
+          <w:tcPr>
+            <w:tcW w:type="dxa" w:w="4895"/>
           </w:tcPr>
           <w:p>
             <w:pPr>
@@ -9924,13 +12146,13 @@
               <w:rPr>
                 <w:sz w:val="19"/>
               </w:rPr>
-              <w:t>Everything a person goes through when using a product: what they notice, understand, feel and do, from the first look to the last step. The screens are only one part of it.</w:t>
-            </w:r>
-          </w:p>
-        </w:tc>
-        <w:tc>
-          <w:tcPr>
-            <w:tcW w:type="dxa" w:w="1112"/>
+              <w:t>A system that follows fixed rules written by people: the same input always gives the same output, and the rule can be said in one sentence.</w:t>
+            </w:r>
+          </w:p>
+        </w:tc>
+        <w:tc>
+          <w:tcPr>
+            <w:tcW w:type="dxa" w:w="1101"/>
           </w:tcPr>
           <w:p>
             <w:pPr>
@@ -9940,7 +12162,7 @@
               <w:rPr>
                 <w:sz w:val="19"/>
               </w:rPr>
-              <w:t>Finding the booking you want at once and feeling sure it went through is a good UX.</w:t>
+              <w:t>—</w:t>
             </w:r>
           </w:p>
         </w:tc>
@@ -9956,7 +12178,7 @@
               <w:rPr>
                 <w:sz w:val="19"/>
               </w:rPr>
-              <w:t>Day 1</w:t>
+              <w:t>Day 10</w:t>
             </w:r>
           </w:p>
         </w:tc>
@@ -9967,7 +12189,7 @@
         </w:trPr>
         <w:tc>
           <w:tcPr>
-            <w:tcW w:type="dxa" w:w="2737"/>
+            <w:tcW w:type="dxa" w:w="2735"/>
           </w:tcPr>
           <w:p>
             <w:pPr>
@@ -9978,13 +12200,153 @@
                 <w:b/>
                 <w:sz w:val="19"/>
               </w:rPr>
+              <w:t>Touchpoint</w:t>
+            </w:r>
+          </w:p>
+        </w:tc>
+        <w:tc>
+          <w:tcPr>
+            <w:tcW w:type="dxa" w:w="4895"/>
+          </w:tcPr>
+          <w:p>
+            <w:pPr>
+              <w:spacing w:before="0" w:after="0"/>
+            </w:pPr>
+            <w:r>
+              <w:rPr>
+                <w:sz w:val="19"/>
+              </w:rPr>
+              <w:t>Any place where a person meets the company: the website, the customer portal, the app, a chatbot or a phone call.</w:t>
+            </w:r>
+          </w:p>
+        </w:tc>
+        <w:tc>
+          <w:tcPr>
+            <w:tcW w:type="dxa" w:w="1101"/>
+          </w:tcPr>
+          <w:p>
+            <w:pPr>
+              <w:spacing w:before="0" w:after="0"/>
+            </w:pPr>
+            <w:r>
+              <w:rPr>
+                <w:sz w:val="19"/>
+              </w:rPr>
+              <w:t>—</w:t>
+            </w:r>
+          </w:p>
+        </w:tc>
+        <w:tc>
+          <w:tcPr>
+            <w:tcW w:type="dxa" w:w="907"/>
+          </w:tcPr>
+          <w:p>
+            <w:pPr>
+              <w:spacing w:before="0" w:after="0"/>
+            </w:pPr>
+            <w:r>
+              <w:rPr>
+                <w:sz w:val="19"/>
+              </w:rPr>
+              <w:t>Day 1</w:t>
+            </w:r>
+          </w:p>
+        </w:tc>
+      </w:tr>
+      <w:tr>
+        <w:trPr>
+          <w:cantSplit/>
+        </w:trPr>
+        <w:tc>
+          <w:tcPr>
+            <w:tcW w:type="dxa" w:w="2735"/>
+          </w:tcPr>
+          <w:p>
+            <w:pPr>
+              <w:spacing w:before="0" w:after="0"/>
+            </w:pPr>
+            <w:r>
+              <w:rPr>
+                <w:b/>
+                <w:sz w:val="19"/>
+              </w:rPr>
+              <w:t>UX (user experience)</w:t>
+            </w:r>
+          </w:p>
+        </w:tc>
+        <w:tc>
+          <w:tcPr>
+            <w:tcW w:type="dxa" w:w="4895"/>
+          </w:tcPr>
+          <w:p>
+            <w:pPr>
+              <w:spacing w:before="0" w:after="0"/>
+            </w:pPr>
+            <w:r>
+              <w:rPr>
+                <w:sz w:val="19"/>
+              </w:rPr>
+              <w:t>Everything a person goes through when using a product: what they notice, understand, feel and do, from the first look to the last step. The screens are only one part of it.</w:t>
+            </w:r>
+          </w:p>
+        </w:tc>
+        <w:tc>
+          <w:tcPr>
+            <w:tcW w:type="dxa" w:w="1101"/>
+          </w:tcPr>
+          <w:p>
+            <w:pPr>
+              <w:spacing w:before="0" w:after="0"/>
+            </w:pPr>
+            <w:r>
+              <w:rPr>
+                <w:sz w:val="19"/>
+              </w:rPr>
+              <w:t>Finding the booking you want at once and feeling sure it went through is a good UX.</w:t>
+            </w:r>
+          </w:p>
+        </w:tc>
+        <w:tc>
+          <w:tcPr>
+            <w:tcW w:type="dxa" w:w="907"/>
+          </w:tcPr>
+          <w:p>
+            <w:pPr>
+              <w:spacing w:before="0" w:after="0"/>
+            </w:pPr>
+            <w:r>
+              <w:rPr>
+                <w:sz w:val="19"/>
+              </w:rPr>
+              <w:t>Day 1</w:t>
+            </w:r>
+          </w:p>
+        </w:tc>
+      </w:tr>
+      <w:tr>
+        <w:trPr>
+          <w:cantSplit/>
+        </w:trPr>
+        <w:tc>
+          <w:tcPr>
+            <w:tcW w:type="dxa" w:w="2735"/>
+          </w:tcPr>
+          <w:p>
+            <w:pPr>
+              <w:spacing w:before="0" w:after="0"/>
+            </w:pPr>
+            <w:r>
+              <w:rPr>
+                <w:b/>
+                <w:sz w:val="19"/>
+              </w:rPr>
               <w:t>Voice user interface</w:t>
             </w:r>
           </w:p>
         </w:tc>
         <w:tc>
           <w:tcPr>
-            <w:tcW w:type="dxa" w:w="4882"/>
+            <w:tcW w:type="dxa" w:w="4895"/>
           </w:tcPr>
           <w:p>
             <w:pPr>
@@ -10000,7 +12362,7 @@
         </w:tc>
         <w:tc>
           <w:tcPr>
-            <w:tcW w:type="dxa" w:w="1112"/>
+            <w:tcW w:type="dxa" w:w="1101"/>
           </w:tcPr>
           <w:p>
             <w:pPr>

</xml_diff>